<commit_message>
docs: add test contract files for review testing
Co-Authored-By: Claude Opus 4.7 <noreply@anthropic.com>
</commit_message>
<xml_diff>
--- a/docs/咨询服务标准合同-测试.docx
+++ b/docs/咨询服务标准合同-测试.docx
@@ -31,16 +31,7 @@
           <w:highlight w:val="yellow"/>
           <w:lang w:eastAsia="zh-CN"/>
         </w:rPr>
-        <w:t>甲方（委托方）：______</w:t>
-      </w:r>
-      <w:bookmarkStart w:id="1" w:name="_GoBack"/>
-      <w:bookmarkEnd w:id="1"/>
-      <w:r>
-        <w:rPr>
-          <w:highlight w:val="yellow"/>
-          <w:lang w:eastAsia="zh-CN"/>
-        </w:rPr>
-        <w:t>_</w:t>
+        <w:t>甲方（委托方）：_______</w:t>
       </w:r>
       <w:r>
         <w:rPr>
@@ -90,6 +81,8 @@
         </w:rPr>
         <w:t>地址：__________________________________</w:t>
       </w:r>
+      <w:bookmarkStart w:id="1" w:name="_GoBack"/>
+      <w:bookmarkEnd w:id="1"/>
     </w:p>
     <w:p>
       <w:pPr>
@@ -150,7 +143,21 @@
         <w:rPr>
           <w:lang w:eastAsia="zh-CN"/>
         </w:rPr>
-        <w:t>________________</w:t>
+        <w:t>_</w:t>
+      </w:r>
+      <w:r>
+        <w:rPr>
+          <w:rFonts w:hint="eastAsia"/>
+          <w:u w:val="single"/>
+          <w:lang w:val="en-US" w:eastAsia="zh-CN"/>
+        </w:rPr>
+        <w:t>1509345732815794</w:t>
+      </w:r>
+      <w:r>
+        <w:rPr>
+          <w:lang w:eastAsia="zh-CN"/>
+        </w:rPr>
+        <w:t>_</w:t>
       </w:r>
     </w:p>
     <w:bookmarkEnd w:id="0"/>
@@ -2551,7 +2558,7 @@
     <w:lsdException w:qFormat="1" w:unhideWhenUsed="0" w:uiPriority="10" w:semiHidden="0" w:name="Title"/>
     <w:lsdException w:uiPriority="99" w:name="Closing"/>
     <w:lsdException w:uiPriority="99" w:name="Signature"/>
-    <w:lsdException w:uiPriority="1" w:name="Default Paragraph Font"/>
+    <w:lsdException w:qFormat="1" w:uiPriority="1" w:name="Default Paragraph Font"/>
     <w:lsdException w:uiPriority="99" w:name="Body Text"/>
     <w:lsdException w:uiPriority="99" w:name="Body Text Indent"/>
     <w:lsdException w:uiPriority="99" w:name="List Continue"/>
@@ -2754,6 +2761,7 @@
     <w:name w:val="Default Paragraph Font"/>
     <w:semiHidden/>
     <w:unhideWhenUsed/>
+    <w:qFormat/>
     <w:uiPriority w:val="1"/>
   </w:style>
   <w:style w:type="table" w:default="1" w:styleId="3">

</xml_diff>

<commit_message>
feat: table cell parsing, improved fillable diff detection, and rule generation
Parser rewrite to handle DOCX table cells and nested SDT/ins/del elements;
frontend auto-annotation for table-cell trailing colons and zero-width zones;
generate_rules.py for context-based fillable zone classification.

Co-Authored-By: Claude Opus 4.7 <noreply@anthropic.com>
</commit_message>
<xml_diff>
--- a/docs/咨询服务标准合同-测试.docx
+++ b/docs/咨询服务标准合同-测试.docx
@@ -81,8 +81,6 @@
         </w:rPr>
         <w:t>地址：__________________________________</w:t>
       </w:r>
-      <w:bookmarkStart w:id="1" w:name="_GoBack"/>
-      <w:bookmarkEnd w:id="1"/>
     </w:p>
     <w:p>
       <w:pPr>
@@ -2186,7 +2184,9 @@
               <w:pStyle w:val="14"/>
               <w:jc w:val="center"/>
               <w:rPr>
+                <w:rFonts w:hint="default" w:eastAsia="宋体"/>
                 <w:highlight w:val="yellow"/>
+                <w:lang w:val="en-US" w:eastAsia="zh-CN"/>
               </w:rPr>
             </w:pPr>
             <w:permStart w:id="7" w:edGrp="everyone" w:colFirst="0" w:colLast="0"/>
@@ -2197,6 +2197,16 @@
               </w:rPr>
               <w:t>甲方（盖章）：</w:t>
             </w:r>
+            <w:r>
+              <w:rPr>
+                <w:rFonts w:hint="eastAsia"/>
+                <w:highlight w:val="yellow"/>
+                <w:lang w:val="en-US" w:eastAsia="zh-CN"/>
+              </w:rPr>
+              <w:t>123</w:t>
+            </w:r>
+            <w:bookmarkStart w:id="1" w:name="_GoBack"/>
+            <w:bookmarkEnd w:id="1"/>
           </w:p>
         </w:tc>
         <w:tc>

</xml_diff>

<commit_message>
chore: update test document, database, and cleanup notes
Co-Authored-By: Claude Opus 4.7 <noreply@anthropic.com>
</commit_message>
<xml_diff>
--- a/docs/咨询服务标准合同-测试.docx
+++ b/docs/咨询服务标准合同-测试.docx
@@ -63,7 +63,23 @@
           <w:highlight w:val="yellow"/>
           <w:lang w:eastAsia="zh-CN"/>
         </w:rPr>
-        <w:t>统一社会信用代码：______________________</w:t>
+        <w:t>统一社会信用代码：_________</w:t>
+      </w:r>
+      <w:r>
+        <w:rPr>
+          <w:rFonts w:hint="eastAsia"/>
+          <w:highlight w:val="yellow"/>
+          <w:lang w:val="en-US" w:eastAsia="zh-CN"/>
+        </w:rPr>
+        <w:t>1234</w:t>
+      </w:r>
+      <w:r>
+        <w:rPr>
+          <w:rFonts w:hint="eastAsia"/>
+          <w:highlight w:val="yellow"/>
+          <w:lang w:eastAsia="zh-CN"/>
+        </w:rPr>
+        <w:t>_____________</w:t>
       </w:r>
     </w:p>
     <w:p>
@@ -79,7 +95,23 @@
           <w:highlight w:val="cyan"/>
           <w:lang w:eastAsia="zh-CN"/>
         </w:rPr>
-        <w:t>地址：__________________________________</w:t>
+        <w:t>地址：______________</w:t>
+      </w:r>
+      <w:r>
+        <w:rPr>
+          <w:rFonts w:hint="eastAsia"/>
+          <w:highlight w:val="cyan"/>
+          <w:lang w:val="en-US" w:eastAsia="zh-CN"/>
+        </w:rPr>
+        <w:t>重庆铜梁卧龙</w:t>
+      </w:r>
+      <w:r>
+        <w:rPr>
+          <w:rFonts w:hint="eastAsia"/>
+          <w:highlight w:val="cyan"/>
+          <w:lang w:eastAsia="zh-CN"/>
+        </w:rPr>
+        <w:t>____________________</w:t>
       </w:r>
     </w:p>
     <w:p>
@@ -96,7 +128,23 @@
           <w:highlight w:val="cyan"/>
           <w:lang w:eastAsia="zh-CN"/>
         </w:rPr>
-        <w:t>法定代表人/负责人：_____________________</w:t>
+        <w:t>法定代表人/负责人：_________</w:t>
+      </w:r>
+      <w:r>
+        <w:rPr>
+          <w:rFonts w:hint="eastAsia"/>
+          <w:highlight w:val="cyan"/>
+          <w:lang w:val="en-US" w:eastAsia="zh-CN"/>
+        </w:rPr>
+        <w:t>张三</w:t>
+      </w:r>
+      <w:r>
+        <w:rPr>
+          <w:rFonts w:hint="eastAsia"/>
+          <w:highlight w:val="cyan"/>
+          <w:lang w:eastAsia="zh-CN"/>
+        </w:rPr>
+        <w:t>____________</w:t>
       </w:r>
       <w:del w:id="0" w:author="湖畔的雨荷" w:date="2026-06-09T17:17:59Z">
         <w:r>
@@ -128,7 +176,20 @@
         <w:rPr>
           <w:lang w:eastAsia="zh-CN"/>
         </w:rPr>
-        <w:t xml:space="preserve">________________ </w:t>
+        <w:t>_______</w:t>
+      </w:r>
+      <w:r>
+        <w:rPr>
+          <w:rFonts w:hint="eastAsia"/>
+          <w:lang w:val="en-US" w:eastAsia="zh-CN"/>
+        </w:rPr>
+        <w:t>李四</w:t>
+      </w:r>
+      <w:r>
+        <w:rPr>
+          <w:lang w:eastAsia="zh-CN"/>
+        </w:rPr>
+        <w:t xml:space="preserve">_________ </w:t>
       </w:r>
       <w:r>
         <w:rPr>
@@ -180,7 +241,22 @@
           <w:highlight w:val="yellow"/>
           <w:lang w:eastAsia="zh-CN"/>
         </w:rPr>
-        <w:t>乙方（受托方）：________________________</w:t>
+        <w:t>乙方（受托方）：__________</w:t>
+      </w:r>
+      <w:r>
+        <w:rPr>
+          <w:rFonts w:hint="eastAsia"/>
+          <w:highlight w:val="yellow"/>
+          <w:lang w:val="en-US" w:eastAsia="zh-CN"/>
+        </w:rPr>
+        <w:t>王五</w:t>
+      </w:r>
+      <w:r>
+        <w:rPr>
+          <w:highlight w:val="yellow"/>
+          <w:lang w:eastAsia="zh-CN"/>
+        </w:rPr>
+        <w:t>______________</w:t>
       </w:r>
     </w:p>
     <w:p>
@@ -197,7 +273,23 @@
           <w:highlight w:val="yellow"/>
           <w:lang w:eastAsia="zh-CN"/>
         </w:rPr>
-        <w:t>统一社会信用代码：______________________</w:t>
+        <w:t>统一社会信用代码：_________</w:t>
+      </w:r>
+      <w:r>
+        <w:rPr>
+          <w:rFonts w:hint="eastAsia"/>
+          <w:highlight w:val="yellow"/>
+          <w:lang w:val="en-US" w:eastAsia="zh-CN"/>
+        </w:rPr>
+        <w:t>124</w:t>
+      </w:r>
+      <w:r>
+        <w:rPr>
+          <w:rFonts w:hint="eastAsia"/>
+          <w:highlight w:val="yellow"/>
+          <w:lang w:eastAsia="zh-CN"/>
+        </w:rPr>
+        <w:t>_____________</w:t>
       </w:r>
     </w:p>
     <w:p>
@@ -213,7 +305,23 @@
           <w:highlight w:val="cyan"/>
           <w:lang w:eastAsia="zh-CN"/>
         </w:rPr>
-        <w:t>地址：__________________________________</w:t>
+        <w:t>地址：_______________</w:t>
+      </w:r>
+      <w:r>
+        <w:rPr>
+          <w:rFonts w:hint="eastAsia"/>
+          <w:highlight w:val="cyan"/>
+          <w:lang w:val="en-US" w:eastAsia="zh-CN"/>
+        </w:rPr>
+        <w:t>阿斯蒂芬</w:t>
+      </w:r>
+      <w:r>
+        <w:rPr>
+          <w:rFonts w:hint="eastAsia"/>
+          <w:highlight w:val="cyan"/>
+          <w:lang w:eastAsia="zh-CN"/>
+        </w:rPr>
+        <w:t>___________________</w:t>
       </w:r>
     </w:p>
     <w:p>
@@ -230,7 +338,23 @@
           <w:highlight w:val="cyan"/>
           <w:lang w:eastAsia="zh-CN"/>
         </w:rPr>
-        <w:t>法定代表人/负责人：______________________</w:t>
+        <w:t>法定代表人/负责人：______</w:t>
+      </w:r>
+      <w:r>
+        <w:rPr>
+          <w:rFonts w:hint="eastAsia"/>
+          <w:highlight w:val="cyan"/>
+          <w:lang w:val="en-US" w:eastAsia="zh-CN"/>
+        </w:rPr>
+        <w:t>啊是电饭锅</w:t>
+      </w:r>
+      <w:r>
+        <w:rPr>
+          <w:rFonts w:hint="eastAsia"/>
+          <w:highlight w:val="cyan"/>
+          <w:lang w:eastAsia="zh-CN"/>
+        </w:rPr>
+        <w:t>________________</w:t>
       </w:r>
     </w:p>
     <w:p>
@@ -251,7 +375,20 @@
         <w:rPr>
           <w:lang w:eastAsia="zh-CN"/>
         </w:rPr>
-        <w:t xml:space="preserve">________________ </w:t>
+        <w:t>________</w:t>
+      </w:r>
+      <w:r>
+        <w:rPr>
+          <w:rFonts w:hint="eastAsia"/>
+          <w:lang w:val="en-US" w:eastAsia="zh-CN"/>
+        </w:rPr>
+        <w:t>爱社</w:t>
+      </w:r>
+      <w:r>
+        <w:rPr>
+          <w:lang w:eastAsia="zh-CN"/>
+        </w:rPr>
+        <w:t xml:space="preserve">________ </w:t>
       </w:r>
       <w:r>
         <w:rPr>
@@ -264,7 +401,20 @@
         <w:rPr>
           <w:lang w:eastAsia="zh-CN"/>
         </w:rPr>
-        <w:t>________________</w:t>
+        <w:t>_______</w:t>
+      </w:r>
+      <w:r>
+        <w:rPr>
+          <w:rFonts w:hint="eastAsia"/>
+          <w:lang w:val="en-US" w:eastAsia="zh-CN"/>
+        </w:rPr>
+        <w:t>456</w:t>
+      </w:r>
+      <w:r>
+        <w:rPr>
+          <w:lang w:eastAsia="zh-CN"/>
+        </w:rPr>
+        <w:t>_________</w:t>
       </w:r>
     </w:p>
     <w:p>
@@ -304,6 +454,26 @@
     </w:p>
     <w:p>
       <w:pPr>
+        <w:rPr>
+          <w:lang w:eastAsia="zh-CN"/>
+        </w:rPr>
+      </w:pPr>
+      <w:r>
+        <w:rPr>
+          <w:lang w:eastAsia="zh-CN"/>
+        </w:rPr>
+        <w:t>根据《中华人民共和国民》及相关法律法规的规定，甲乙双方本着平等自愿、协商一致、诚实信用的原则，就甲方委托乙方提供咨询服务事宜，达成如下协议，以资共同遵守。</w:t>
+      </w:r>
+    </w:p>
+    <w:p>
+      <w:pPr>
+        <w:rPr>
+          <w:lang w:eastAsia="zh-CN"/>
+        </w:rPr>
+      </w:pPr>
+    </w:p>
+    <w:p>
+      <w:pPr>
         <w:pStyle w:val="8"/>
         <w:rPr>
           <w:lang w:eastAsia="zh-CN"/>
@@ -330,7 +500,22 @@
           <w:highlight w:val="cyan"/>
           <w:lang w:eastAsia="zh-CN"/>
         </w:rPr>
-        <w:t>1.1 甲方委托乙方就________________________事宜（以下简称"本项目"）提供专业咨询服务。</w:t>
+        <w:t>1.1 甲方委托乙方就__________</w:t>
+      </w:r>
+      <w:r>
+        <w:rPr>
+          <w:rFonts w:hint="eastAsia"/>
+          <w:highlight w:val="cyan"/>
+          <w:lang w:val="en-US" w:eastAsia="zh-CN"/>
+        </w:rPr>
+        <w:t>啊时代光华</w:t>
+      </w:r>
+      <w:r>
+        <w:rPr>
+          <w:highlight w:val="cyan"/>
+          <w:lang w:eastAsia="zh-CN"/>
+        </w:rPr>
+        <w:t>______________事宜（以下简称"本项目"）提供专业咨询服务。</w:t>
       </w:r>
     </w:p>
     <w:p>
@@ -349,38 +534,18 @@
         <w:t>1.2 具体咨询服务内容包括但不限于：</w:t>
       </w:r>
     </w:p>
-    <w:p>
-      <w:pPr>
-        <w:pStyle w:val="11"/>
-        <w:rPr>
-          <w:highlight w:val="yellow"/>
-        </w:rPr>
-      </w:pPr>
-      <w:del w:id="1" w:author="湖畔的雨荷" w:date="2026-06-09T17:17:04Z">
-        <w:r>
-          <w:rPr>
-            <w:highlight w:val="yellow"/>
-          </w:rPr>
-          <w:delText>（1）</w:delText>
-        </w:r>
-      </w:del>
-      <w:r>
-        <w:rPr>
-          <w:highlight w:val="yellow"/>
-        </w:rPr>
-        <w:t>________________________________________________________；</w:t>
-      </w:r>
-    </w:p>
     <w:permEnd w:id="1"/>
     <w:p>
       <w:pPr>
         <w:pStyle w:val="11"/>
         <w:rPr>
-          <w:del w:id="2" w:author="湖畔的雨荷" w:date="2026-06-09T17:17:06Z"/>
-          <w:highlight w:val="cyan"/>
-        </w:rPr>
-      </w:pPr>
-      <w:del w:id="3" w:author="湖畔的雨荷" w:date="2026-06-09T17:17:06Z">
+          <w:del w:id="1" w:author="湖畔的雨荷" w:date="2026-06-09T17:17:06Z"/>
+          <w:highlight w:val="cyan"/>
+        </w:rPr>
+      </w:pPr>
+      <w:del w:id="2" w:author="湖畔的雨荷" w:date="2026-06-09T17:17:06Z">
+        <w:bookmarkStart w:id="1" w:name="_GoBack"/>
+        <w:bookmarkEnd w:id="1"/>
         <w:r>
           <w:rPr>
             <w:highlight w:val="cyan"/>
@@ -393,11 +558,11 @@
       <w:pPr>
         <w:pStyle w:val="11"/>
         <w:rPr>
-          <w:del w:id="4" w:author="湖畔的雨荷" w:date="2026-06-09T17:17:06Z"/>
-          <w:highlight w:val="cyan"/>
-        </w:rPr>
-      </w:pPr>
-      <w:del w:id="5" w:author="湖畔的雨荷" w:date="2026-06-09T17:17:06Z">
+          <w:del w:id="3" w:author="湖畔的雨荷" w:date="2026-06-09T17:17:06Z"/>
+          <w:highlight w:val="cyan"/>
+        </w:rPr>
+      </w:pPr>
+      <w:del w:id="4" w:author="湖畔的雨荷" w:date="2026-06-09T17:17:06Z">
         <w:r>
           <w:rPr>
             <w:highlight w:val="cyan"/>
@@ -410,11 +575,11 @@
       <w:pPr>
         <w:pStyle w:val="11"/>
         <w:rPr>
-          <w:del w:id="6" w:author="湖畔的雨荷" w:date="2026-06-09T17:17:06Z"/>
-          <w:highlight w:val="cyan"/>
-        </w:rPr>
-      </w:pPr>
-      <w:del w:id="7" w:author="湖畔的雨荷" w:date="2026-06-09T17:17:06Z">
+          <w:del w:id="5" w:author="湖畔的雨荷" w:date="2026-06-09T17:17:06Z"/>
+          <w:highlight w:val="cyan"/>
+        </w:rPr>
+      </w:pPr>
+      <w:del w:id="6" w:author="湖畔的雨荷" w:date="2026-06-09T17:17:06Z">
         <w:r>
           <w:rPr>
             <w:highlight w:val="cyan"/>
@@ -425,20 +590,6 @@
     </w:p>
     <w:p>
       <w:pPr>
-        <w:pStyle w:val="11"/>
-        <w:rPr>
-          <w:lang w:eastAsia="zh-CN"/>
-        </w:rPr>
-      </w:pPr>
-      <w:r>
-        <w:rPr>
-          <w:lang w:eastAsia="zh-CN"/>
-        </w:rPr>
-        <w:t>1.3 乙方应按照甲方的要求，完成咨询服务工作并提交符合本协议约定标准的咨询成果。</w:t>
-      </w:r>
-    </w:p>
-    <w:p>
-      <w:pPr>
         <w:pStyle w:val="8"/>
         <w:rPr>
           <w:lang w:eastAsia="zh-CN"/>
@@ -471,23 +622,143 @@
           <w:highlight w:val="yellow"/>
           <w:lang w:eastAsia="zh-CN"/>
         </w:rPr>
-        <w:t xml:space="preserve"> 本协议项下咨询服务期限自______年____月____日起至______年____月____日止。如需延期，双方应另行签订补充协议。</w:t>
-      </w:r>
-    </w:p>
-    <w:p>
-      <w:pPr>
-        <w:pStyle w:val="11"/>
-        <w:rPr>
-          <w:highlight w:val="cyan"/>
-          <w:lang w:eastAsia="zh-CN"/>
-        </w:rPr>
-      </w:pPr>
-      <w:r>
-        <w:rPr>
-          <w:highlight w:val="cyan"/>
-          <w:lang w:eastAsia="zh-CN"/>
-        </w:rPr>
-        <w:t>2.2 乙方应组建专业服务团队，指定项目负责人________________________，联系方式________________________，负责本项目的全程服务与沟通协调。</w:t>
+        <w:t xml:space="preserve"> 本协议项下咨询服务期限自___</w:t>
+      </w:r>
+      <w:r>
+        <w:rPr>
+          <w:rFonts w:hint="eastAsia"/>
+          <w:highlight w:val="yellow"/>
+          <w:lang w:val="en-US" w:eastAsia="zh-CN"/>
+        </w:rPr>
+        <w:t>2026</w:t>
+      </w:r>
+      <w:r>
+        <w:rPr>
+          <w:highlight w:val="yellow"/>
+          <w:lang w:eastAsia="zh-CN"/>
+        </w:rPr>
+        <w:t>___年__</w:t>
+      </w:r>
+      <w:r>
+        <w:rPr>
+          <w:rFonts w:hint="eastAsia"/>
+          <w:highlight w:val="yellow"/>
+          <w:lang w:val="en-US" w:eastAsia="zh-CN"/>
+        </w:rPr>
+        <w:t>12</w:t>
+      </w:r>
+      <w:r>
+        <w:rPr>
+          <w:highlight w:val="yellow"/>
+          <w:lang w:eastAsia="zh-CN"/>
+        </w:rPr>
+        <w:t>__月__</w:t>
+      </w:r>
+      <w:r>
+        <w:rPr>
+          <w:rFonts w:hint="eastAsia"/>
+          <w:highlight w:val="yellow"/>
+          <w:lang w:val="en-US" w:eastAsia="zh-CN"/>
+        </w:rPr>
+        <w:t>3</w:t>
+      </w:r>
+      <w:r>
+        <w:rPr>
+          <w:highlight w:val="yellow"/>
+          <w:lang w:eastAsia="zh-CN"/>
+        </w:rPr>
+        <w:t>__日起至_</w:t>
+      </w:r>
+      <w:r>
+        <w:rPr>
+          <w:rFonts w:hint="eastAsia"/>
+          <w:highlight w:val="yellow"/>
+          <w:lang w:val="en-US" w:eastAsia="zh-CN"/>
+        </w:rPr>
+        <w:t>2027</w:t>
+      </w:r>
+      <w:r>
+        <w:rPr>
+          <w:highlight w:val="yellow"/>
+          <w:lang w:eastAsia="zh-CN"/>
+        </w:rPr>
+        <w:t>_____年__</w:t>
+      </w:r>
+      <w:r>
+        <w:rPr>
+          <w:rFonts w:hint="eastAsia"/>
+          <w:highlight w:val="yellow"/>
+          <w:lang w:val="en-US" w:eastAsia="zh-CN"/>
+        </w:rPr>
+        <w:t>5</w:t>
+      </w:r>
+      <w:r>
+        <w:rPr>
+          <w:highlight w:val="yellow"/>
+          <w:lang w:eastAsia="zh-CN"/>
+        </w:rPr>
+        <w:t>__月__</w:t>
+      </w:r>
+      <w:r>
+        <w:rPr>
+          <w:rFonts w:hint="eastAsia"/>
+          <w:highlight w:val="yellow"/>
+          <w:lang w:val="en-US" w:eastAsia="zh-CN"/>
+        </w:rPr>
+        <w:t>8</w:t>
+      </w:r>
+      <w:r>
+        <w:rPr>
+          <w:highlight w:val="yellow"/>
+          <w:lang w:eastAsia="zh-CN"/>
+        </w:rPr>
+        <w:t>__日止。如需延期，双方应另行签订补充协议。</w:t>
+      </w:r>
+    </w:p>
+    <w:p>
+      <w:pPr>
+        <w:pStyle w:val="11"/>
+        <w:rPr>
+          <w:highlight w:val="cyan"/>
+          <w:lang w:eastAsia="zh-CN"/>
+        </w:rPr>
+      </w:pPr>
+      <w:r>
+        <w:rPr>
+          <w:highlight w:val="cyan"/>
+          <w:lang w:eastAsia="zh-CN"/>
+        </w:rPr>
+        <w:t>2.2 乙方应组建专业服务团队，指定项目负责人_______</w:t>
+      </w:r>
+      <w:r>
+        <w:rPr>
+          <w:rFonts w:hint="eastAsia"/>
+          <w:highlight w:val="cyan"/>
+          <w:lang w:val="en-US" w:eastAsia="zh-CN"/>
+        </w:rPr>
+        <w:t>阿萨德</w:t>
+      </w:r>
+      <w:r>
+        <w:rPr>
+          <w:highlight w:val="cyan"/>
+          <w:lang w:eastAsia="zh-CN"/>
+        </w:rPr>
+        <w:t>_________________，联系方式______________</w:t>
+      </w:r>
+      <w:r>
+        <w:rPr>
+          <w:rFonts w:hint="eastAsia"/>
+          <w:highlight w:val="cyan"/>
+          <w:lang w:val="en-US" w:eastAsia="zh-CN"/>
+        </w:rPr>
+        <w:t>194856535846</w:t>
+      </w:r>
+      <w:r>
+        <w:rPr>
+          <w:highlight w:val="cyan"/>
+          <w:lang w:eastAsia="zh-CN"/>
+        </w:rPr>
+        <w:t>__________，负责本项目的全程服务与沟通协调。</w:t>
       </w:r>
     </w:p>
     <w:permEnd w:id="2"/>
@@ -539,7 +810,82 @@
           <w:highlight w:val="cyan"/>
           <w:lang w:eastAsia="zh-CN"/>
         </w:rPr>
-        <w:t>4 乙方应在服务期限内完成全部咨询服务工作，并于______年____月____日前向甲方提交正式的咨询成果报告（含纸质版____份、电子版____份）。</w:t>
+        <w:t>4 乙方应在服务期限内完成全部咨询服务工作，并于___</w:t>
+      </w:r>
+      <w:r>
+        <w:rPr>
+          <w:rFonts w:hint="eastAsia"/>
+          <w:highlight w:val="cyan"/>
+          <w:lang w:val="en-US" w:eastAsia="zh-CN"/>
+        </w:rPr>
+        <w:t>2026</w:t>
+      </w:r>
+      <w:r>
+        <w:rPr>
+          <w:highlight w:val="cyan"/>
+          <w:lang w:eastAsia="zh-CN"/>
+        </w:rPr>
+        <w:t>___年__</w:t>
+      </w:r>
+      <w:r>
+        <w:rPr>
+          <w:rFonts w:hint="eastAsia"/>
+          <w:highlight w:val="cyan"/>
+          <w:lang w:val="en-US" w:eastAsia="zh-CN"/>
+        </w:rPr>
+        <w:t>2</w:t>
+      </w:r>
+      <w:r>
+        <w:rPr>
+          <w:highlight w:val="cyan"/>
+          <w:lang w:eastAsia="zh-CN"/>
+        </w:rPr>
+        <w:t>__月__</w:t>
+      </w:r>
+      <w:r>
+        <w:rPr>
+          <w:rFonts w:hint="eastAsia"/>
+          <w:highlight w:val="cyan"/>
+          <w:lang w:val="en-US" w:eastAsia="zh-CN"/>
+        </w:rPr>
+        <w:t>5</w:t>
+      </w:r>
+      <w:r>
+        <w:rPr>
+          <w:highlight w:val="cyan"/>
+          <w:lang w:eastAsia="zh-CN"/>
+        </w:rPr>
+        <w:t>__日前向甲方提交正式的咨询成果报告（含纸质版__</w:t>
+      </w:r>
+      <w:r>
+        <w:rPr>
+          <w:rFonts w:hint="eastAsia"/>
+          <w:highlight w:val="cyan"/>
+          <w:lang w:val="en-US" w:eastAsia="zh-CN"/>
+        </w:rPr>
+        <w:t>2</w:t>
+      </w:r>
+      <w:r>
+        <w:rPr>
+          <w:highlight w:val="cyan"/>
+          <w:lang w:eastAsia="zh-CN"/>
+        </w:rPr>
+        <w:t>__份、电子版_</w:t>
+      </w:r>
+      <w:r>
+        <w:rPr>
+          <w:rFonts w:hint="eastAsia"/>
+          <w:highlight w:val="cyan"/>
+          <w:lang w:val="en-US" w:eastAsia="zh-CN"/>
+        </w:rPr>
+        <w:t>3</w:t>
+      </w:r>
+      <w:r>
+        <w:rPr>
+          <w:highlight w:val="cyan"/>
+          <w:lang w:eastAsia="zh-CN"/>
+        </w:rPr>
+        <w:t>___份）。</w:t>
       </w:r>
     </w:p>
     <w:permEnd w:id="3"/>
@@ -911,12 +1257,43 @@
       </w:r>
       <w:r>
         <w:rPr>
+          <w:rStyle w:val="6"/>
+          <w:rFonts w:hint="eastAsia"/>
+          <w:bCs/>
           <w:color w:val="000000"/>
           <w:szCs w:val="24"/>
           <w:highlight w:val="cyan"/>
-          <w:lang w:eastAsia="zh-CN"/>
-        </w:rPr>
-        <w:t>，单价：__________元；</w:t>
+          <w:lang w:val="en-US" w:eastAsia="zh-CN"/>
+        </w:rPr>
+        <w:t>张</w:t>
+      </w:r>
+      <w:r>
+        <w:rPr>
+          <w:color w:val="000000"/>
+          <w:szCs w:val="24"/>
+          <w:highlight w:val="cyan"/>
+          <w:lang w:eastAsia="zh-CN"/>
+        </w:rPr>
+        <w:t>，单价：____</w:t>
+      </w:r>
+      <w:r>
+        <w:rPr>
+          <w:rFonts w:hint="eastAsia"/>
+          <w:color w:val="000000"/>
+          <w:szCs w:val="24"/>
+          <w:highlight w:val="cyan"/>
+          <w:lang w:val="en-US" w:eastAsia="zh-CN"/>
+        </w:rPr>
+        <w:t>IU</w:t>
+      </w:r>
+      <w:r>
+        <w:rPr>
+          <w:color w:val="000000"/>
+          <w:szCs w:val="24"/>
+          <w:highlight w:val="cyan"/>
+          <w:lang w:eastAsia="zh-CN"/>
+        </w:rPr>
+        <w:t>______元；</w:t>
       </w:r>
     </w:p>
     <w:p>
@@ -978,59 +1355,112 @@
       </w:r>
       <w:r>
         <w:rPr>
+          <w:rStyle w:val="6"/>
+          <w:rFonts w:hint="eastAsia"/>
+          <w:bCs/>
           <w:color w:val="000000"/>
           <w:szCs w:val="24"/>
           <w:highlight w:val="cyan"/>
-          <w:lang w:eastAsia="zh-CN"/>
-        </w:rPr>
-        <w:t>，单价：__________元；</w:t>
-      </w:r>
-    </w:p>
-    <w:p>
-      <w:pPr>
-        <w:spacing w:after="0" w:line="360" w:lineRule="atLeast"/>
+          <w:lang w:val="en-US" w:eastAsia="zh-CN"/>
+        </w:rPr>
+        <w:t>元</w:t>
+      </w:r>
+      <w:r>
         <w:rPr>
           <w:color w:val="000000"/>
           <w:szCs w:val="24"/>
           <w:highlight w:val="cyan"/>
           <w:lang w:eastAsia="zh-CN"/>
         </w:rPr>
-      </w:pPr>
-      <w:r>
-        <w:rPr>
-          <w:rFonts w:ascii="Symbol" w:hAnsi="Symbol" w:eastAsia="Symbol" w:cs="Symbol"/>
-          <w:highlight w:val="cyan"/>
-          <w:lang w:eastAsia="zh-CN"/>
-        </w:rPr>
-        <w:t></w:t>
-      </w:r>
-      <w:r>
-        <w:rPr>
-          <w:rFonts w:hint="eastAsia" w:cs="宋体"/>
-          <w:highlight w:val="cyan"/>
-          <w:lang w:eastAsia="zh-CN"/>
-        </w:rPr>
-        <w:t xml:space="preserve">  </w:t>
-      </w:r>
-      <w:r>
-        <w:rPr>
+        <w:t>，单价：____</w:t>
+      </w:r>
+      <w:r>
+        <w:rPr>
+          <w:rFonts w:hint="eastAsia"/>
           <w:color w:val="000000"/>
           <w:szCs w:val="24"/>
           <w:highlight w:val="cyan"/>
-          <w:lang w:eastAsia="zh-CN"/>
-        </w:rPr>
-        <w:t>服务项目：</w:t>
-      </w:r>
-      <w:r>
-        <w:rPr>
-          <w:rFonts w:hint="eastAsia"/>
+          <w:lang w:val="en-US" w:eastAsia="zh-CN"/>
+        </w:rPr>
+        <w:t>阿萨德</w:t>
+      </w:r>
+      <w:r>
+        <w:rPr>
           <w:color w:val="000000"/>
           <w:szCs w:val="24"/>
           <w:highlight w:val="cyan"/>
+          <w:lang w:eastAsia="zh-CN"/>
+        </w:rPr>
+        <w:t>______元；</w:t>
+      </w:r>
+    </w:p>
+    <w:p>
+      <w:pPr>
+        <w:spacing w:after="0" w:line="360" w:lineRule="atLeast"/>
+        <w:rPr>
+          <w:color w:val="000000"/>
+          <w:szCs w:val="24"/>
+          <w:highlight w:val="cyan"/>
+          <w:lang w:eastAsia="zh-CN"/>
+        </w:rPr>
+      </w:pPr>
+      <w:r>
+        <w:rPr>
+          <w:rFonts w:ascii="Symbol" w:hAnsi="Symbol" w:eastAsia="Symbol" w:cs="Symbol"/>
+          <w:highlight w:val="cyan"/>
+          <w:lang w:eastAsia="zh-CN"/>
+        </w:rPr>
+        <w:t></w:t>
+      </w:r>
+      <w:r>
+        <w:rPr>
+          <w:rFonts w:hint="eastAsia" w:cs="宋体"/>
+          <w:highlight w:val="cyan"/>
+          <w:lang w:eastAsia="zh-CN"/>
+        </w:rPr>
+        <w:t xml:space="preserve">  </w:t>
+      </w:r>
+      <w:r>
+        <w:rPr>
+          <w:color w:val="000000"/>
+          <w:szCs w:val="24"/>
+          <w:highlight w:val="cyan"/>
+          <w:lang w:eastAsia="zh-CN"/>
+        </w:rPr>
+        <w:t>服务项目：</w:t>
+      </w:r>
+      <w:r>
+        <w:rPr>
+          <w:rFonts w:hint="eastAsia"/>
+          <w:color w:val="000000"/>
+          <w:szCs w:val="24"/>
+          <w:highlight w:val="cyan"/>
           <w:u w:val="single"/>
           <w:lang w:eastAsia="zh-CN"/>
         </w:rPr>
-        <w:t xml:space="preserve">             </w:t>
+        <w:t xml:space="preserve">        </w:t>
+      </w:r>
+      <w:r>
+        <w:rPr>
+          <w:rFonts w:hint="eastAsia"/>
+          <w:color w:val="000000"/>
+          <w:szCs w:val="24"/>
+          <w:highlight w:val="cyan"/>
+          <w:u w:val="single"/>
+          <w:lang w:val="en-US" w:eastAsia="zh-CN"/>
+        </w:rPr>
+        <w:t>是否更换</w:t>
+      </w:r>
+      <w:r>
+        <w:rPr>
+          <w:rFonts w:hint="eastAsia"/>
+          <w:color w:val="000000"/>
+          <w:szCs w:val="24"/>
+          <w:highlight w:val="cyan"/>
+          <w:u w:val="single"/>
+          <w:lang w:eastAsia="zh-CN"/>
+        </w:rPr>
+        <w:t xml:space="preserve">     </w:t>
       </w:r>
       <w:r>
         <w:rPr>
@@ -1045,37 +1475,83 @@
       </w:r>
       <w:r>
         <w:rPr>
+          <w:rStyle w:val="6"/>
+          <w:rFonts w:hint="eastAsia"/>
+          <w:bCs/>
           <w:color w:val="000000"/>
           <w:szCs w:val="24"/>
           <w:highlight w:val="cyan"/>
-          <w:lang w:eastAsia="zh-CN"/>
-        </w:rPr>
-        <w:t>，单价：__________元。</w:t>
-      </w:r>
-    </w:p>
-    <w:p>
-      <w:pPr>
-        <w:pStyle w:val="11"/>
-        <w:rPr>
-          <w:highlight w:val="cyan"/>
-          <w:lang w:eastAsia="zh-CN"/>
-        </w:rPr>
-      </w:pPr>
-    </w:p>
-    <w:p>
-      <w:pPr>
-        <w:pStyle w:val="11"/>
-        <w:rPr>
-          <w:highlight w:val="cyan"/>
-          <w:lang w:eastAsia="zh-CN"/>
-        </w:rPr>
-      </w:pPr>
-      <w:r>
-        <w:rPr>
-          <w:highlight w:val="cyan"/>
-          <w:lang w:eastAsia="zh-CN"/>
-        </w:rPr>
-        <w:t>（3）按实际成本加合理利润计费：成本据实核算，利润率为______%。</w:t>
+          <w:lang w:val="en-US" w:eastAsia="zh-CN"/>
+        </w:rPr>
+        <w:t>123</w:t>
+      </w:r>
+      <w:r>
+        <w:rPr>
+          <w:color w:val="000000"/>
+          <w:szCs w:val="24"/>
+          <w:highlight w:val="cyan"/>
+          <w:lang w:eastAsia="zh-CN"/>
+        </w:rPr>
+        <w:t>，单价：____</w:t>
+      </w:r>
+      <w:r>
+        <w:rPr>
+          <w:rFonts w:hint="eastAsia"/>
+          <w:color w:val="000000"/>
+          <w:szCs w:val="24"/>
+          <w:highlight w:val="cyan"/>
+          <w:lang w:val="en-US" w:eastAsia="zh-CN"/>
+        </w:rPr>
+        <w:t>123</w:t>
+      </w:r>
+      <w:r>
+        <w:rPr>
+          <w:color w:val="000000"/>
+          <w:szCs w:val="24"/>
+          <w:highlight w:val="cyan"/>
+          <w:lang w:eastAsia="zh-CN"/>
+        </w:rPr>
+        <w:t>______元。</w:t>
+      </w:r>
+    </w:p>
+    <w:p>
+      <w:pPr>
+        <w:pStyle w:val="11"/>
+        <w:rPr>
+          <w:highlight w:val="cyan"/>
+          <w:lang w:eastAsia="zh-CN"/>
+        </w:rPr>
+      </w:pPr>
+    </w:p>
+    <w:p>
+      <w:pPr>
+        <w:pStyle w:val="11"/>
+        <w:rPr>
+          <w:highlight w:val="cyan"/>
+          <w:lang w:eastAsia="zh-CN"/>
+        </w:rPr>
+      </w:pPr>
+      <w:r>
+        <w:rPr>
+          <w:highlight w:val="cyan"/>
+          <w:lang w:eastAsia="zh-CN"/>
+        </w:rPr>
+        <w:t>（3）按实际成本加合理利润计费：成本据实核算，利润率为__</w:t>
+      </w:r>
+      <w:r>
+        <w:rPr>
+          <w:rFonts w:hint="eastAsia"/>
+          <w:highlight w:val="cyan"/>
+          <w:lang w:val="en-US" w:eastAsia="zh-CN"/>
+        </w:rPr>
+        <w:t>12</w:t>
+      </w:r>
+      <w:r>
+        <w:rPr>
+          <w:highlight w:val="cyan"/>
+          <w:lang w:eastAsia="zh-CN"/>
+        </w:rPr>
+        <w:t>____%。</w:t>
       </w:r>
     </w:p>
     <w:p>
@@ -1105,7 +1581,52 @@
           <w:highlight w:val="cyan"/>
           <w:lang w:eastAsia="zh-CN"/>
         </w:rPr>
-        <w:t>（1）预付款：协议生效后____个工作日内，甲方向乙方支付总费用的______%作为预付款，即人民币______元；</w:t>
+        <w:t>（1）预付款：协议生效后__</w:t>
+      </w:r>
+      <w:r>
+        <w:rPr>
+          <w:rFonts w:hint="eastAsia"/>
+          <w:highlight w:val="cyan"/>
+          <w:lang w:val="en-US" w:eastAsia="zh-CN"/>
+        </w:rPr>
+        <w:t>2</w:t>
+      </w:r>
+      <w:r>
+        <w:rPr>
+          <w:highlight w:val="cyan"/>
+          <w:lang w:eastAsia="zh-CN"/>
+        </w:rPr>
+        <w:t>__个工作日内，甲方向乙方支付总费用的__</w:t>
+      </w:r>
+      <w:r>
+        <w:rPr>
+          <w:rFonts w:hint="eastAsia"/>
+          <w:highlight w:val="cyan"/>
+          <w:lang w:val="en-US" w:eastAsia="zh-CN"/>
+        </w:rPr>
+        <w:t>12</w:t>
+      </w:r>
+      <w:r>
+        <w:rPr>
+          <w:highlight w:val="cyan"/>
+          <w:lang w:eastAsia="zh-CN"/>
+        </w:rPr>
+        <w:t>____%作为预付款，即人民币____</w:t>
+      </w:r>
+      <w:r>
+        <w:rPr>
+          <w:rFonts w:hint="eastAsia"/>
+          <w:highlight w:val="cyan"/>
+          <w:lang w:val="en-US" w:eastAsia="zh-CN"/>
+        </w:rPr>
+        <w:t>阿迪</w:t>
+      </w:r>
+      <w:r>
+        <w:rPr>
+          <w:highlight w:val="cyan"/>
+          <w:lang w:eastAsia="zh-CN"/>
+        </w:rPr>
+        <w:t>__元；</w:t>
       </w:r>
     </w:p>
     <w:p>
@@ -2205,8 +2726,6 @@
               </w:rPr>
               <w:t>123</w:t>
             </w:r>
-            <w:bookmarkStart w:id="1" w:name="_GoBack"/>
-            <w:bookmarkEnd w:id="1"/>
           </w:p>
         </w:tc>
         <w:tc>
@@ -2218,7 +2737,9 @@
               <w:pStyle w:val="14"/>
               <w:jc w:val="center"/>
               <w:rPr>
+                <w:rFonts w:hint="eastAsia" w:eastAsia="宋体"/>
                 <w:highlight w:val="yellow"/>
+                <w:lang w:val="en-US" w:eastAsia="zh-CN"/>
               </w:rPr>
             </w:pPr>
             <w:r>
@@ -2226,6 +2747,14 @@
                 <w:highlight w:val="yellow"/>
               </w:rPr>
               <w:t>乙方（盖章）：</w:t>
+            </w:r>
+            <w:r>
+              <w:rPr>
+                <w:rFonts w:hint="eastAsia"/>
+                <w:highlight w:val="yellow"/>
+                <w:lang w:val="en-US" w:eastAsia="zh-CN"/>
+              </w:rPr>
+              <w:t>张三</w:t>
             </w:r>
           </w:p>
         </w:tc>
@@ -2258,7 +2787,9 @@
               <w:pStyle w:val="14"/>
               <w:jc w:val="center"/>
               <w:rPr>
+                <w:rFonts w:hint="eastAsia" w:eastAsia="宋体"/>
                 <w:highlight w:val="yellow"/>
+                <w:lang w:val="en-US" w:eastAsia="zh-CN"/>
               </w:rPr>
             </w:pPr>
             <w:permStart w:id="9" w:edGrp="everyone" w:colFirst="0" w:colLast="0"/>
@@ -2268,6 +2799,14 @@
                 <w:highlight w:val="yellow"/>
               </w:rPr>
               <w:t>法定代表人/负责人：</w:t>
+            </w:r>
+            <w:r>
+              <w:rPr>
+                <w:rFonts w:hint="eastAsia"/>
+                <w:highlight w:val="yellow"/>
+                <w:lang w:val="en-US" w:eastAsia="zh-CN"/>
+              </w:rPr>
+              <w:t>阿萨德</w:t>
             </w:r>
           </w:p>
         </w:tc>
@@ -2280,7 +2819,9 @@
               <w:pStyle w:val="14"/>
               <w:jc w:val="center"/>
               <w:rPr>
+                <w:rFonts w:hint="eastAsia" w:eastAsia="宋体"/>
                 <w:highlight w:val="yellow"/>
+                <w:lang w:val="en-US" w:eastAsia="zh-CN"/>
               </w:rPr>
             </w:pPr>
             <w:r>
@@ -2288,6 +2829,14 @@
                 <w:highlight w:val="yellow"/>
               </w:rPr>
               <w:t>法定代表人：</w:t>
+            </w:r>
+            <w:r>
+              <w:rPr>
+                <w:rFonts w:hint="eastAsia"/>
+                <w:highlight w:val="yellow"/>
+                <w:lang w:val="en-US" w:eastAsia="zh-CN"/>
+              </w:rPr>
+              <w:t>分割后</w:t>
             </w:r>
           </w:p>
         </w:tc>
@@ -2320,7 +2869,9 @@
               <w:pStyle w:val="14"/>
               <w:jc w:val="center"/>
               <w:rPr>
+                <w:rFonts w:hint="eastAsia" w:eastAsia="宋体"/>
                 <w:highlight w:val="yellow"/>
+                <w:lang w:val="en-US" w:eastAsia="zh-CN"/>
               </w:rPr>
             </w:pPr>
             <w:permStart w:id="11" w:edGrp="everyone" w:colFirst="0" w:colLast="0"/>
@@ -2330,6 +2881,14 @@
                 <w:highlight w:val="yellow"/>
               </w:rPr>
               <w:t>授权代理人：</w:t>
+            </w:r>
+            <w:r>
+              <w:rPr>
+                <w:rFonts w:hint="eastAsia"/>
+                <w:highlight w:val="yellow"/>
+                <w:lang w:val="en-US" w:eastAsia="zh-CN"/>
+              </w:rPr>
+              <w:t>爱社</w:t>
             </w:r>
           </w:p>
         </w:tc>
@@ -2342,7 +2901,9 @@
               <w:pStyle w:val="14"/>
               <w:jc w:val="center"/>
               <w:rPr>
+                <w:rFonts w:hint="eastAsia" w:eastAsia="宋体"/>
                 <w:highlight w:val="yellow"/>
+                <w:lang w:val="en-US" w:eastAsia="zh-CN"/>
               </w:rPr>
             </w:pPr>
             <w:r>
@@ -2350,6 +2911,14 @@
                 <w:highlight w:val="yellow"/>
               </w:rPr>
               <w:t>授权代理人：</w:t>
+            </w:r>
+            <w:r>
+              <w:rPr>
+                <w:rFonts w:hint="eastAsia"/>
+                <w:highlight w:val="yellow"/>
+                <w:lang w:val="en-US" w:eastAsia="zh-CN"/>
+              </w:rPr>
+              <w:t>尺寸</w:t>
             </w:r>
           </w:p>
         </w:tc>

</xml_diff>

<commit_message>
fix: add template-document mismatch detection via title comparison
Add first-paragraph title check in run_compare/run_validate to reject
unrelated documents before running expensive diff/validation. Frontend
now catches review API errors and displays them via ElMessage instead
of hanging on failure.

Co-Authored-By: Claude Opus 4.7 <noreply@anthropic.com>
</commit_message>
<xml_diff>
--- a/docs/咨询服务标准合同-测试.docx
+++ b/docs/咨询服务标准合同-测试.docx
@@ -31,7 +31,22 @@
           <w:highlight w:val="yellow"/>
           <w:lang w:eastAsia="zh-CN"/>
         </w:rPr>
-        <w:t>甲方（委托方）：________________________</w:t>
+        <w:t>甲方（委托方）：_________</w:t>
+      </w:r>
+      <w:r>
+        <w:rPr>
+          <w:rFonts w:ascii="宋体" w:hAnsi="宋体" w:eastAsia="宋体" w:cs="宋体"/>
+          <w:sz w:val="24"/>
+          <w:szCs w:val="24"/>
+        </w:rPr>
+        <w:t>北京恒信科技发展有限公司</w:t>
+      </w:r>
+      <w:r>
+        <w:rPr>
+          <w:highlight w:val="yellow"/>
+          <w:lang w:eastAsia="zh-CN"/>
+        </w:rPr>
+        <w:t>_______________</w:t>
       </w:r>
     </w:p>
     <w:p>
@@ -48,7 +63,23 @@
           <w:highlight w:val="yellow"/>
           <w:lang w:eastAsia="zh-CN"/>
         </w:rPr>
-        <w:t>统一社会信用代码：______________________</w:t>
+        <w:t>统一社会信用代码：_________</w:t>
+      </w:r>
+      <w:r>
+        <w:rPr>
+          <w:rFonts w:ascii="宋体" w:hAnsi="宋体" w:eastAsia="宋体" w:cs="宋体"/>
+          <w:sz w:val="24"/>
+          <w:szCs w:val="24"/>
+        </w:rPr>
+        <w:t>91110108MA01ABCD12</w:t>
+      </w:r>
+      <w:r>
+        <w:rPr>
+          <w:rFonts w:hint="eastAsia"/>
+          <w:highlight w:val="yellow"/>
+          <w:lang w:eastAsia="zh-CN"/>
+        </w:rPr>
+        <w:t>_____________</w:t>
       </w:r>
     </w:p>
     <w:p>
@@ -64,7 +95,23 @@
           <w:highlight w:val="cyan"/>
           <w:lang w:eastAsia="zh-CN"/>
         </w:rPr>
-        <w:t>地址：__________________________________</w:t>
+        <w:t>地址：__________</w:t>
+      </w:r>
+      <w:r>
+        <w:rPr>
+          <w:rFonts w:ascii="宋体" w:hAnsi="宋体" w:eastAsia="宋体" w:cs="宋体"/>
+          <w:sz w:val="24"/>
+          <w:szCs w:val="24"/>
+        </w:rPr>
+        <w:t>北京市海淀区中关村软件园 8 号楼 12 层</w:t>
+      </w:r>
+      <w:r>
+        <w:rPr>
+          <w:rFonts w:hint="eastAsia"/>
+          <w:highlight w:val="cyan"/>
+          <w:lang w:eastAsia="zh-CN"/>
+        </w:rPr>
+        <w:t>______________</w:t>
       </w:r>
     </w:p>
     <w:p>
@@ -81,7 +128,23 @@
           <w:highlight w:val="cyan"/>
           <w:lang w:eastAsia="zh-CN"/>
         </w:rPr>
-        <w:t>法定代表人/负责人：_____________________</w:t>
+        <w:t>法定代表人/负责人：_________</w:t>
+      </w:r>
+      <w:r>
+        <w:rPr>
+          <w:rFonts w:ascii="宋体" w:hAnsi="宋体" w:eastAsia="宋体" w:cs="宋体"/>
+          <w:sz w:val="24"/>
+          <w:szCs w:val="24"/>
+        </w:rPr>
+        <w:t>张明</w:t>
+      </w:r>
+      <w:r>
+        <w:rPr>
+          <w:rFonts w:hint="eastAsia"/>
+          <w:highlight w:val="cyan"/>
+          <w:lang w:eastAsia="zh-CN"/>
+        </w:rPr>
+        <w:t>____________</w:t>
       </w:r>
       <w:del w:id="0" w:author="湖畔的雨荷" w:date="2026-06-09T17:17:59Z">
         <w:r>
@@ -113,7 +176,7 @@
         <w:rPr>
           <w:lang w:eastAsia="zh-CN"/>
         </w:rPr>
-        <w:t xml:space="preserve">________________ </w:t>
+        <w:t xml:space="preserve">_______李文博 _______ </w:t>
       </w:r>
       <w:r>
         <w:rPr>
@@ -126,7 +189,21 @@
         <w:rPr>
           <w:lang w:eastAsia="zh-CN"/>
         </w:rPr>
-        <w:t>________________</w:t>
+        <w:t>______</w:t>
+      </w:r>
+      <w:r>
+        <w:rPr>
+          <w:rFonts w:ascii="宋体" w:hAnsi="宋体" w:eastAsia="宋体" w:cs="宋体"/>
+          <w:sz w:val="24"/>
+          <w:szCs w:val="24"/>
+        </w:rPr>
+        <w:t>13800138000</w:t>
+      </w:r>
+      <w:r>
+        <w:rPr>
+          <w:lang w:eastAsia="zh-CN"/>
+        </w:rPr>
+        <w:t>______</w:t>
       </w:r>
     </w:p>
     <w:bookmarkEnd w:id="0"/>
@@ -151,7 +228,22 @@
           <w:highlight w:val="yellow"/>
           <w:lang w:eastAsia="zh-CN"/>
         </w:rPr>
-        <w:t>乙方（受托方）：________________________</w:t>
+        <w:t>乙方（受托方）：_________</w:t>
+      </w:r>
+      <w:r>
+        <w:rPr>
+          <w:rFonts w:ascii="宋体" w:hAnsi="宋体" w:eastAsia="宋体" w:cs="宋体"/>
+          <w:sz w:val="24"/>
+          <w:szCs w:val="24"/>
+        </w:rPr>
+        <w:t>上海智远企业管理咨询有限公司</w:t>
+      </w:r>
+      <w:r>
+        <w:rPr>
+          <w:highlight w:val="yellow"/>
+          <w:lang w:eastAsia="zh-CN"/>
+        </w:rPr>
+        <w:t>_______________</w:t>
       </w:r>
     </w:p>
     <w:p>
@@ -168,7 +260,23 @@
           <w:highlight w:val="yellow"/>
           <w:lang w:eastAsia="zh-CN"/>
         </w:rPr>
-        <w:t>统一社会信用代码：______________________</w:t>
+        <w:t>统一社会信用代码：__________</w:t>
+      </w:r>
+      <w:r>
+        <w:rPr>
+          <w:rFonts w:ascii="宋体" w:hAnsi="宋体" w:eastAsia="宋体" w:cs="宋体"/>
+          <w:sz w:val="24"/>
+          <w:szCs w:val="24"/>
+        </w:rPr>
+        <w:t>91310104MA1FRXYZ89</w:t>
+      </w:r>
+      <w:r>
+        <w:rPr>
+          <w:rFonts w:hint="eastAsia"/>
+          <w:highlight w:val="yellow"/>
+          <w:lang w:eastAsia="zh-CN"/>
+        </w:rPr>
+        <w:t>____________</w:t>
       </w:r>
     </w:p>
     <w:p>
@@ -184,7 +292,23 @@
           <w:highlight w:val="cyan"/>
           <w:lang w:eastAsia="zh-CN"/>
         </w:rPr>
-        <w:t>地址：__________________________________</w:t>
+        <w:t>地址：________</w:t>
+      </w:r>
+      <w:r>
+        <w:rPr>
+          <w:rFonts w:ascii="宋体" w:hAnsi="宋体" w:eastAsia="宋体" w:cs="宋体"/>
+          <w:sz w:val="24"/>
+          <w:szCs w:val="24"/>
+        </w:rPr>
+        <w:t>上海市徐汇区漕河泾开发区桂平路 391 号 B 座 15 层</w:t>
+      </w:r>
+      <w:r>
+        <w:rPr>
+          <w:rFonts w:hint="eastAsia"/>
+          <w:highlight w:val="cyan"/>
+          <w:lang w:eastAsia="zh-CN"/>
+        </w:rPr>
+        <w:t>__________</w:t>
       </w:r>
     </w:p>
     <w:p>
@@ -201,7 +325,23 @@
           <w:highlight w:val="cyan"/>
           <w:lang w:eastAsia="zh-CN"/>
         </w:rPr>
-        <w:t>法定代表人/负责人：______________________</w:t>
+        <w:t>法定代表人/负责人：__________</w:t>
+      </w:r>
+      <w:r>
+        <w:rPr>
+          <w:rFonts w:ascii="宋体" w:hAnsi="宋体" w:eastAsia="宋体" w:cs="宋体"/>
+          <w:sz w:val="24"/>
+          <w:szCs w:val="24"/>
+        </w:rPr>
+        <w:t>王建国</w:t>
+      </w:r>
+      <w:r>
+        <w:rPr>
+          <w:rFonts w:hint="eastAsia"/>
+          <w:highlight w:val="cyan"/>
+          <w:lang w:eastAsia="zh-CN"/>
+        </w:rPr>
+        <w:t>____________</w:t>
       </w:r>
     </w:p>
     <w:p>
@@ -222,7 +362,21 @@
         <w:rPr>
           <w:lang w:eastAsia="zh-CN"/>
         </w:rPr>
-        <w:t xml:space="preserve">________________ </w:t>
+        <w:t>_________</w:t>
+      </w:r>
+      <w:r>
+        <w:rPr>
+          <w:rFonts w:ascii="宋体" w:hAnsi="宋体" w:eastAsia="宋体" w:cs="宋体"/>
+          <w:sz w:val="24"/>
+          <w:szCs w:val="24"/>
+        </w:rPr>
+        <w:t>赵晓琳</w:t>
+      </w:r>
+      <w:r>
+        <w:rPr>
+          <w:lang w:eastAsia="zh-CN"/>
+        </w:rPr>
+        <w:t xml:space="preserve">_______ </w:t>
       </w:r>
       <w:r>
         <w:rPr>
@@ -235,7 +389,21 @@
         <w:rPr>
           <w:lang w:eastAsia="zh-CN"/>
         </w:rPr>
-        <w:t>________________</w:t>
+        <w:t>_______</w:t>
+      </w:r>
+      <w:r>
+        <w:rPr>
+          <w:rFonts w:ascii="宋体" w:hAnsi="宋体" w:eastAsia="宋体" w:cs="宋体"/>
+          <w:sz w:val="24"/>
+          <w:szCs w:val="24"/>
+        </w:rPr>
+        <w:t>13900139000</w:t>
+      </w:r>
+      <w:r>
+        <w:rPr>
+          <w:lang w:eastAsia="zh-CN"/>
+        </w:rPr>
+        <w:t>_________</w:t>
       </w:r>
     </w:p>
     <w:p>
@@ -249,7 +417,21 @@
         <w:rPr>
           <w:lang w:eastAsia="zh-CN"/>
         </w:rPr>
-        <w:t>资质证明：________________________________</w:t>
+        <w:t>资质证明：________</w:t>
+      </w:r>
+      <w:r>
+        <w:rPr>
+          <w:rFonts w:ascii="宋体" w:hAnsi="宋体" w:eastAsia="宋体" w:cs="宋体"/>
+          <w:sz w:val="24"/>
+          <w:szCs w:val="24"/>
+        </w:rPr>
+        <w:t>企业管理咨询甲级资质证书 编号：ZX-2024-0089</w:t>
+      </w:r>
+      <w:r>
+        <w:rPr>
+          <w:lang w:eastAsia="zh-CN"/>
+        </w:rPr>
+        <w:t>____________</w:t>
       </w:r>
     </w:p>
     <w:permEnd w:id="0"/>
@@ -301,7 +483,22 @@
           <w:highlight w:val="cyan"/>
           <w:lang w:eastAsia="zh-CN"/>
         </w:rPr>
-        <w:t>1.1 甲方委托乙方就________________________事宜（以下简称"本项目"）提供专业咨询服务。</w:t>
+        <w:t>1.1 甲方委托乙方就__________</w:t>
+      </w:r>
+      <w:r>
+        <w:rPr>
+          <w:rFonts w:ascii="宋体" w:hAnsi="宋体" w:eastAsia="宋体" w:cs="宋体"/>
+          <w:sz w:val="24"/>
+          <w:szCs w:val="24"/>
+        </w:rPr>
+        <w:t>企业数字化转型战略规划与落地路径</w:t>
+      </w:r>
+      <w:r>
+        <w:rPr>
+          <w:highlight w:val="cyan"/>
+          <w:lang w:eastAsia="zh-CN"/>
+        </w:rPr>
+        <w:t>______________事宜（以下简称"本项目"）提供专业咨询服务。</w:t>
       </w:r>
     </w:p>
     <w:p>
@@ -327,31 +524,157 @@
           <w:highlight w:val="yellow"/>
         </w:rPr>
       </w:pPr>
-      <w:del w:id="1" w:author="湖畔的雨荷" w:date="2026-06-09T17:17:04Z">
-        <w:r>
-          <w:rPr>
-            <w:highlight w:val="yellow"/>
-          </w:rPr>
-          <w:delText>（1）</w:delText>
-        </w:r>
-      </w:del>
-      <w:r>
-        <w:rPr>
-          <w:highlight w:val="yellow"/>
-        </w:rPr>
-        <w:t>________________________________________________________；</w:t>
-      </w:r>
+      <w:r>
+        <w:rPr>
+          <w:highlight w:val="yellow"/>
+        </w:rPr>
+        <w:t>·</w:t>
+      </w:r>
+      <w:r>
+        <w:rPr>
+          <w:rFonts w:hint="eastAsia"/>
+          <w:highlight w:val="yellow"/>
+        </w:rPr>
+        <w:t xml:space="preserve"> </w:t>
+      </w:r>
+      <w:r>
+        <w:rPr>
+          <w:rFonts w:ascii="宋体" w:hAnsi="宋体" w:eastAsia="宋体" w:cs="宋体"/>
+          <w:sz w:val="24"/>
+          <w:szCs w:val="24"/>
+        </w:rPr>
+        <w:t>甲方现有业务流程与信息化现状诊断、痛点分析；</w:t>
+      </w:r>
+    </w:p>
+    <w:p>
+      <w:pPr>
+        <w:pStyle w:val="11"/>
+        <w:rPr>
+          <w:highlight w:val="yellow"/>
+        </w:rPr>
+      </w:pPr>
+      <w:r>
+        <w:rPr>
+          <w:highlight w:val="yellow"/>
+        </w:rPr>
+        <w:t>·</w:t>
+      </w:r>
+      <w:r>
+        <w:rPr>
+          <w:rFonts w:hint="eastAsia"/>
+          <w:highlight w:val="yellow"/>
+        </w:rPr>
+        <w:t xml:space="preserve">  </w:t>
+      </w:r>
+      <w:r>
+        <w:rPr>
+          <w:highlight w:val="yellow"/>
+        </w:rPr>
+        <w:t>数字化转型整体战略框架、阶段目标与核心指标制定；</w:t>
+      </w:r>
+    </w:p>
+    <w:p>
+      <w:pPr>
+        <w:pStyle w:val="11"/>
+        <w:rPr>
+          <w:highlight w:val="yellow"/>
+        </w:rPr>
+      </w:pPr>
+      <w:r>
+        <w:rPr>
+          <w:rFonts w:hint="default"/>
+          <w:highlight w:val="yellow"/>
+        </w:rPr>
+        <w:t>·</w:t>
+      </w:r>
+      <w:r>
+        <w:rPr>
+          <w:rFonts w:hint="eastAsia"/>
+          <w:highlight w:val="yellow"/>
+        </w:rPr>
+        <w:t xml:space="preserve">  </w:t>
+      </w:r>
+      <w:r>
+        <w:rPr>
+          <w:highlight w:val="yellow"/>
+        </w:rPr>
+        <w:t>核心业务流程数字化优化方案与组织适配建议；</w:t>
+      </w:r>
+    </w:p>
+    <w:p>
+      <w:pPr>
+        <w:pStyle w:val="11"/>
+        <w:rPr>
+          <w:highlight w:val="yellow"/>
+        </w:rPr>
+      </w:pPr>
+      <w:r>
+        <w:rPr>
+          <w:rFonts w:hint="default"/>
+          <w:highlight w:val="yellow"/>
+        </w:rPr>
+        <w:t>·</w:t>
+      </w:r>
+      <w:r>
+        <w:rPr>
+          <w:rFonts w:hint="eastAsia"/>
+          <w:highlight w:val="yellow"/>
+        </w:rPr>
+        <w:t xml:space="preserve">  </w:t>
+      </w:r>
+      <w:r>
+        <w:rPr>
+          <w:highlight w:val="yellow"/>
+        </w:rPr>
+        <w:t>数字化系统技术选型、实施路径与投入产出测算；</w:t>
+      </w:r>
+    </w:p>
+    <w:p>
+      <w:pPr>
+        <w:pStyle w:val="11"/>
+        <w:rPr>
+          <w:highlight w:val="yellow"/>
+        </w:rPr>
+      </w:pPr>
+      <w:r>
+        <w:rPr>
+          <w:rFonts w:hint="default"/>
+          <w:highlight w:val="yellow"/>
+        </w:rPr>
+        <w:t>·</w:t>
+      </w:r>
+      <w:r>
+        <w:rPr>
+          <w:rFonts w:hint="eastAsia"/>
+          <w:highlight w:val="yellow"/>
+        </w:rPr>
+        <w:t xml:space="preserve">  </w:t>
+      </w:r>
+      <w:r>
+        <w:rPr>
+          <w:highlight w:val="yellow"/>
+        </w:rPr>
+        <w:t>转型风险识别与防控方案、落地执行里程碑规划</w:t>
+      </w:r>
+    </w:p>
+    <w:p>
+      <w:pPr>
+        <w:pStyle w:val="11"/>
+        <w:rPr>
+          <w:highlight w:val="yellow"/>
+        </w:rPr>
+      </w:pPr>
     </w:p>
     <w:permEnd w:id="1"/>
     <w:p>
       <w:pPr>
         <w:pStyle w:val="11"/>
         <w:rPr>
-          <w:del w:id="2" w:author="湖畔的雨荷" w:date="2026-06-09T17:17:06Z"/>
-          <w:highlight w:val="cyan"/>
-        </w:rPr>
-      </w:pPr>
-      <w:del w:id="3" w:author="湖畔的雨荷" w:date="2026-06-09T17:17:06Z">
+          <w:del w:id="1" w:author="湖畔的雨荷" w:date="2026-06-09T17:17:06Z"/>
+          <w:highlight w:val="cyan"/>
+        </w:rPr>
+      </w:pPr>
+      <w:del w:id="2" w:author="湖畔的雨荷" w:date="2026-06-09T17:17:06Z">
         <w:r>
           <w:rPr>
             <w:highlight w:val="cyan"/>
@@ -364,11 +687,11 @@
       <w:pPr>
         <w:pStyle w:val="11"/>
         <w:rPr>
-          <w:del w:id="4" w:author="湖畔的雨荷" w:date="2026-06-09T17:17:06Z"/>
-          <w:highlight w:val="cyan"/>
-        </w:rPr>
-      </w:pPr>
-      <w:del w:id="5" w:author="湖畔的雨荷" w:date="2026-06-09T17:17:06Z">
+          <w:del w:id="3" w:author="湖畔的雨荷" w:date="2026-06-09T17:17:06Z"/>
+          <w:highlight w:val="cyan"/>
+        </w:rPr>
+      </w:pPr>
+      <w:del w:id="4" w:author="湖畔的雨荷" w:date="2026-06-09T17:17:06Z">
         <w:r>
           <w:rPr>
             <w:highlight w:val="cyan"/>
@@ -381,11 +704,11 @@
       <w:pPr>
         <w:pStyle w:val="11"/>
         <w:rPr>
-          <w:del w:id="6" w:author="湖畔的雨荷" w:date="2026-06-09T17:17:06Z"/>
-          <w:highlight w:val="cyan"/>
-        </w:rPr>
-      </w:pPr>
-      <w:del w:id="7" w:author="湖畔的雨荷" w:date="2026-06-09T17:17:06Z">
+          <w:del w:id="5" w:author="湖畔的雨荷" w:date="2026-06-09T17:17:06Z"/>
+          <w:highlight w:val="cyan"/>
+        </w:rPr>
+      </w:pPr>
+      <w:del w:id="6" w:author="湖畔的雨荷" w:date="2026-06-09T17:17:06Z">
         <w:r>
           <w:rPr>
             <w:highlight w:val="cyan"/>
@@ -396,6 +719,20 @@
     </w:p>
     <w:p>
       <w:pPr>
+        <w:pStyle w:val="11"/>
+        <w:rPr>
+          <w:lang w:eastAsia="zh-CN"/>
+        </w:rPr>
+      </w:pPr>
+      <w:r>
+        <w:rPr>
+          <w:lang w:eastAsia="zh-CN"/>
+        </w:rPr>
+        <w:t>1.3 乙方应按照甲方的要求，完成咨询服务工作并提交符合本协议约定标准的咨询成果。</w:t>
+      </w:r>
+    </w:p>
+    <w:p>
+      <w:pPr>
         <w:pStyle w:val="8"/>
         <w:rPr>
           <w:lang w:eastAsia="zh-CN"/>
@@ -428,23 +765,143 @@
           <w:highlight w:val="yellow"/>
           <w:lang w:eastAsia="zh-CN"/>
         </w:rPr>
-        <w:t xml:space="preserve"> 本协议项下咨询服务期限自______年____月____日起至______年____月____日止。如需延期，双方应另行签订补充协议。</w:t>
-      </w:r>
-    </w:p>
-    <w:p>
-      <w:pPr>
-        <w:pStyle w:val="11"/>
-        <w:rPr>
-          <w:highlight w:val="cyan"/>
-          <w:lang w:eastAsia="zh-CN"/>
-        </w:rPr>
-      </w:pPr>
-      <w:r>
-        <w:rPr>
-          <w:highlight w:val="cyan"/>
-          <w:lang w:eastAsia="zh-CN"/>
-        </w:rPr>
-        <w:t>2.2 乙方应组建专业服务团队，指定项目负责人________________________，联系方式________________________，负责本项目的全程服务与沟通协调。</w:t>
+        <w:t xml:space="preserve"> 本协议项下咨询服务期限自___</w:t>
+      </w:r>
+      <w:r>
+        <w:rPr>
+          <w:rFonts w:hint="eastAsia"/>
+          <w:highlight w:val="yellow"/>
+          <w:lang w:val="en-US" w:eastAsia="zh-CN"/>
+        </w:rPr>
+        <w:t>2024</w:t>
+      </w:r>
+      <w:r>
+        <w:rPr>
+          <w:highlight w:val="yellow"/>
+          <w:lang w:eastAsia="zh-CN"/>
+        </w:rPr>
+        <w:t>___年_</w:t>
+      </w:r>
+      <w:r>
+        <w:rPr>
+          <w:rFonts w:hint="eastAsia"/>
+          <w:highlight w:val="yellow"/>
+          <w:lang w:val="en-US" w:eastAsia="zh-CN"/>
+        </w:rPr>
+        <w:t>7</w:t>
+      </w:r>
+      <w:r>
+        <w:rPr>
+          <w:highlight w:val="yellow"/>
+          <w:lang w:eastAsia="zh-CN"/>
+        </w:rPr>
+        <w:t>___月__</w:t>
+      </w:r>
+      <w:r>
+        <w:rPr>
+          <w:rFonts w:hint="eastAsia"/>
+          <w:highlight w:val="yellow"/>
+          <w:lang w:val="en-US" w:eastAsia="zh-CN"/>
+        </w:rPr>
+        <w:t>1</w:t>
+      </w:r>
+      <w:r>
+        <w:rPr>
+          <w:highlight w:val="yellow"/>
+          <w:lang w:eastAsia="zh-CN"/>
+        </w:rPr>
+        <w:t>__日起至__</w:t>
+      </w:r>
+      <w:r>
+        <w:rPr>
+          <w:rFonts w:hint="eastAsia"/>
+          <w:highlight w:val="yellow"/>
+          <w:lang w:val="en-US" w:eastAsia="zh-CN"/>
+        </w:rPr>
+        <w:t>2024</w:t>
+      </w:r>
+      <w:r>
+        <w:rPr>
+          <w:highlight w:val="yellow"/>
+          <w:lang w:eastAsia="zh-CN"/>
+        </w:rPr>
+        <w:t>____年__</w:t>
+      </w:r>
+      <w:r>
+        <w:rPr>
+          <w:rFonts w:hint="eastAsia"/>
+          <w:highlight w:val="yellow"/>
+          <w:lang w:val="en-US" w:eastAsia="zh-CN"/>
+        </w:rPr>
+        <w:t>12</w:t>
+      </w:r>
+      <w:r>
+        <w:rPr>
+          <w:highlight w:val="yellow"/>
+          <w:lang w:eastAsia="zh-CN"/>
+        </w:rPr>
+        <w:t>__月__</w:t>
+      </w:r>
+      <w:r>
+        <w:rPr>
+          <w:rFonts w:hint="eastAsia"/>
+          <w:highlight w:val="yellow"/>
+          <w:lang w:val="en-US" w:eastAsia="zh-CN"/>
+        </w:rPr>
+        <w:t>31</w:t>
+      </w:r>
+      <w:r>
+        <w:rPr>
+          <w:highlight w:val="yellow"/>
+          <w:lang w:eastAsia="zh-CN"/>
+        </w:rPr>
+        <w:t>__日止。如需延期，双方应另行签订补充协议。</w:t>
+      </w:r>
+    </w:p>
+    <w:p>
+      <w:pPr>
+        <w:pStyle w:val="11"/>
+        <w:rPr>
+          <w:highlight w:val="cyan"/>
+          <w:lang w:eastAsia="zh-CN"/>
+        </w:rPr>
+      </w:pPr>
+      <w:r>
+        <w:rPr>
+          <w:highlight w:val="cyan"/>
+          <w:lang w:eastAsia="zh-CN"/>
+        </w:rPr>
+        <w:t>2.2 乙方应组建专业服务团队，指定项目负责人__________</w:t>
+      </w:r>
+      <w:r>
+        <w:rPr>
+          <w:rFonts w:ascii="宋体" w:hAnsi="宋体" w:eastAsia="宋体" w:cs="宋体"/>
+          <w:sz w:val="24"/>
+          <w:szCs w:val="24"/>
+        </w:rPr>
+        <w:t>陈涛</w:t>
+      </w:r>
+      <w:r>
+        <w:rPr>
+          <w:highlight w:val="cyan"/>
+          <w:lang w:eastAsia="zh-CN"/>
+        </w:rPr>
+        <w:t>______________，联系方式________</w:t>
+      </w:r>
+      <w:r>
+        <w:rPr>
+          <w:rFonts w:ascii="宋体" w:hAnsi="宋体" w:eastAsia="宋体" w:cs="宋体"/>
+          <w:sz w:val="24"/>
+          <w:szCs w:val="24"/>
+        </w:rPr>
+        <w:t>13600136000</w:t>
+      </w:r>
+      <w:r>
+        <w:rPr>
+          <w:highlight w:val="cyan"/>
+          <w:lang w:eastAsia="zh-CN"/>
+        </w:rPr>
+        <w:t>________________，负责本项目的全程服务与沟通协调。</w:t>
       </w:r>
     </w:p>
     <w:permEnd w:id="2"/>
@@ -452,14 +909,29 @@
       <w:pPr>
         <w:pStyle w:val="11"/>
         <w:rPr>
-          <w:lang w:eastAsia="zh-CN"/>
-        </w:rPr>
-      </w:pPr>
-      <w:r>
-        <w:rPr>
-          <w:lang w:eastAsia="zh-CN"/>
-        </w:rPr>
-        <w:t>2.3 乙方应保证其服务团队具备相应的专业资质和服务能力，按照行业规范和甲方要求提供服务。</w:t>
+          <w:rFonts w:hint="default"/>
+          <w:lang w:val="en-US" w:eastAsia="zh-CN"/>
+        </w:rPr>
+      </w:pPr>
+      <w:r>
+        <w:rPr>
+          <w:lang w:eastAsia="zh-CN"/>
+        </w:rPr>
+        <w:t>2.3 乙方应保证其服务团队具备相应的专业资质和服务能力，按照行业规范和甲方要求提供服务</w:t>
+      </w:r>
+      <w:r>
+        <w:rPr>
+          <w:rFonts w:hint="eastAsia"/>
+          <w:lang w:eastAsia="zh-CN"/>
+        </w:rPr>
+        <w:t>，</w:t>
+      </w:r>
+      <w:r>
+        <w:rPr>
+          <w:rFonts w:hint="eastAsia"/>
+          <w:lang w:val="en-US" w:eastAsia="zh-CN"/>
+        </w:rPr>
+        <w:t>如出现问题乙方不负任何责任。</w:t>
       </w:r>
     </w:p>
     <w:p>
@@ -488,7 +960,82 @@
           <w:highlight w:val="cyan"/>
           <w:lang w:eastAsia="zh-CN"/>
         </w:rPr>
-        <w:t>4 乙方应在服务期限内完成全部咨询服务工作，并于______年____月____日前向甲方提交正式的咨询成果报告（含纸质版____份、电子版____份）。</w:t>
+        <w:t>4 乙方应在服务期限内完成全部咨询服务工作，并于__</w:t>
+      </w:r>
+      <w:r>
+        <w:rPr>
+          <w:rFonts w:hint="eastAsia"/>
+          <w:highlight w:val="cyan"/>
+          <w:lang w:val="en-US" w:eastAsia="zh-CN"/>
+        </w:rPr>
+        <w:t>2024</w:t>
+      </w:r>
+      <w:r>
+        <w:rPr>
+          <w:highlight w:val="cyan"/>
+          <w:lang w:eastAsia="zh-CN"/>
+        </w:rPr>
+        <w:t>____年__</w:t>
+      </w:r>
+      <w:r>
+        <w:rPr>
+          <w:rFonts w:hint="eastAsia"/>
+          <w:highlight w:val="cyan"/>
+          <w:lang w:val="en-US" w:eastAsia="zh-CN"/>
+        </w:rPr>
+        <w:t>12</w:t>
+      </w:r>
+      <w:r>
+        <w:rPr>
+          <w:highlight w:val="cyan"/>
+          <w:lang w:eastAsia="zh-CN"/>
+        </w:rPr>
+        <w:t>__月__</w:t>
+      </w:r>
+      <w:r>
+        <w:rPr>
+          <w:rFonts w:hint="eastAsia"/>
+          <w:highlight w:val="cyan"/>
+          <w:lang w:val="en-US" w:eastAsia="zh-CN"/>
+        </w:rPr>
+        <w:t>20</w:t>
+      </w:r>
+      <w:r>
+        <w:rPr>
+          <w:highlight w:val="cyan"/>
+          <w:lang w:eastAsia="zh-CN"/>
+        </w:rPr>
+        <w:t>__日前向甲方提交正式的咨询成果报告（含纸质版__</w:t>
+      </w:r>
+      <w:r>
+        <w:rPr>
+          <w:rFonts w:hint="eastAsia"/>
+          <w:highlight w:val="cyan"/>
+          <w:lang w:val="en-US" w:eastAsia="zh-CN"/>
+        </w:rPr>
+        <w:t>3</w:t>
+      </w:r>
+      <w:r>
+        <w:rPr>
+          <w:highlight w:val="cyan"/>
+          <w:lang w:eastAsia="zh-CN"/>
+        </w:rPr>
+        <w:t>__份、电子版__</w:t>
+      </w:r>
+      <w:r>
+        <w:rPr>
+          <w:rFonts w:hint="eastAsia"/>
+          <w:highlight w:val="cyan"/>
+          <w:lang w:val="en-US" w:eastAsia="zh-CN"/>
+        </w:rPr>
+        <w:t>1</w:t>
+      </w:r>
+      <w:r>
+        <w:rPr>
+          <w:highlight w:val="cyan"/>
+          <w:lang w:eastAsia="zh-CN"/>
+        </w:rPr>
+        <w:t>__份）。</w:t>
       </w:r>
     </w:p>
     <w:permEnd w:id="3"/>
@@ -559,20 +1106,6 @@
         <w:rPr>
           <w:lang w:eastAsia="zh-CN"/>
         </w:rPr>
-        <w:t>3.1.3 有权根据服务需要要求乙方更换不称职的服务人员，乙方应在收到通知后3日内完成更换。</w:t>
-      </w:r>
-    </w:p>
-    <w:p>
-      <w:pPr>
-        <w:pStyle w:val="11"/>
-        <w:rPr>
-          <w:lang w:eastAsia="zh-CN"/>
-        </w:rPr>
-      </w:pPr>
-      <w:r>
-        <w:rPr>
-          <w:lang w:eastAsia="zh-CN"/>
-        </w:rPr>
         <w:t>3.1.4 应按照本协议约定及时向乙方支付服务费用。</w:t>
       </w:r>
     </w:p>
@@ -590,7 +1123,22 @@
           <w:highlight w:val="cyan"/>
           <w:lang w:eastAsia="zh-CN"/>
         </w:rPr>
-        <w:t>3.1.5 应为乙方开展咨询服务提供必要的资料、信息和工作协助，指定专人________________________作为项目对接人。</w:t>
+        <w:t>3.1.5 应为乙方开展咨询服务提供必要的资料、信息和工作协助，指定专人___________</w:t>
+      </w:r>
+      <w:r>
+        <w:rPr>
+          <w:rFonts w:ascii="宋体" w:hAnsi="宋体" w:eastAsia="宋体" w:cs="宋体"/>
+          <w:sz w:val="24"/>
+          <w:szCs w:val="24"/>
+        </w:rPr>
+        <w:t>李文博</w:t>
+      </w:r>
+      <w:r>
+        <w:rPr>
+          <w:highlight w:val="cyan"/>
+          <w:lang w:eastAsia="zh-CN"/>
+        </w:rPr>
+        <w:t>_____________作为项目对接人。</w:t>
       </w:r>
     </w:p>
     <w:permEnd w:id="4"/>
@@ -647,6 +1195,20 @@
         <w:rPr>
           <w:lang w:eastAsia="zh-CN"/>
         </w:rPr>
+        <w:t>3.2.2 应保证完全理解甲方的服务要求，组建专业团队提供符合约定标准的咨询服务。</w:t>
+      </w:r>
+    </w:p>
+    <w:p>
+      <w:pPr>
+        <w:pStyle w:val="11"/>
+        <w:rPr>
+          <w:lang w:eastAsia="zh-CN"/>
+        </w:rPr>
+      </w:pPr>
+      <w:r>
+        <w:rPr>
+          <w:lang w:eastAsia="zh-CN"/>
+        </w:rPr>
         <w:t>3.2.3 应保证其提供的咨询成果科学、客观、真实、有效，不存在任何虚假内容，不侵犯任何第三方的知识产权或其他合法权益。</w:t>
       </w:r>
     </w:p>
@@ -753,7 +1315,22 @@
           <w:highlight w:val="yellow"/>
           <w:lang w:eastAsia="zh-CN"/>
         </w:rPr>
-        <w:t>.1 本协议项下咨询服务费用采用以下第____种方式计算：</w:t>
+        <w:t>.1 本协议项下咨询服务费用采用以下第__</w:t>
+      </w:r>
+      <w:r>
+        <w:rPr>
+          <w:rFonts w:hint="eastAsia"/>
+          <w:highlight w:val="yellow"/>
+          <w:lang w:val="en-US" w:eastAsia="zh-CN"/>
+        </w:rPr>
+        <w:t>1</w:t>
+      </w:r>
+      <w:r>
+        <w:rPr>
+          <w:highlight w:val="yellow"/>
+          <w:lang w:eastAsia="zh-CN"/>
+        </w:rPr>
+        <w:t>__种方式计算：</w:t>
       </w:r>
     </w:p>
     <w:p>
@@ -777,101 +1354,112 @@
           <w:highlight w:val="cyan"/>
           <w:lang w:val="en-US" w:eastAsia="zh-CN"/>
         </w:rPr>
-        <w:t>123</w:t>
-      </w:r>
-      <w:r>
-        <w:rPr>
-          <w:highlight w:val="cyan"/>
-          <w:lang w:eastAsia="zh-CN"/>
-        </w:rPr>
-        <w:t>___元（大写：___________</w:t>
-      </w:r>
-      <w:r>
-        <w:rPr>
-          <w:rFonts w:hint="eastAsia"/>
-          <w:highlight w:val="cyan"/>
+        <w:t>280000</w:t>
+      </w:r>
+      <w:r>
+        <w:rPr>
+          <w:highlight w:val="cyan"/>
+          <w:lang w:eastAsia="zh-CN"/>
+        </w:rPr>
+        <w:t>___元（大写：____________</w:t>
+      </w:r>
+      <w:r>
+        <w:rPr>
+          <w:rFonts w:ascii="宋体" w:hAnsi="宋体" w:eastAsia="宋体" w:cs="宋体"/>
+          <w:sz w:val="24"/>
+          <w:szCs w:val="24"/>
+        </w:rPr>
+        <w:t>贰拾捌万</w:t>
+      </w:r>
+      <w:r>
+        <w:rPr>
+          <w:highlight w:val="cyan"/>
+          <w:lang w:eastAsia="zh-CN"/>
+        </w:rPr>
+        <w:t>____________元整），包含人工费、税费、材料费、差旅费等全部费用；</w:t>
+      </w:r>
+    </w:p>
+    <w:p>
+      <w:pPr>
+        <w:pStyle w:val="11"/>
+        <w:rPr>
+          <w:highlight w:val="cyan"/>
+          <w:lang w:eastAsia="zh-CN"/>
+        </w:rPr>
+      </w:pPr>
+      <w:r>
+        <w:rPr>
+          <w:highlight w:val="cyan"/>
+          <w:lang w:eastAsia="zh-CN"/>
+        </w:rPr>
+        <w:t>（2）按服务量计费：具体收费标准如下表：</w:t>
+      </w:r>
+    </w:p>
+    <w:p>
+      <w:pPr>
+        <w:spacing w:after="0" w:line="360" w:lineRule="atLeast"/>
+        <w:rPr>
+          <w:color w:val="000000"/>
+          <w:szCs w:val="24"/>
+          <w:highlight w:val="cyan"/>
+          <w:lang w:eastAsia="zh-CN"/>
+        </w:rPr>
+      </w:pPr>
+      <w:r>
+        <w:rPr>
+          <w:rFonts w:ascii="Symbol" w:hAnsi="Symbol" w:eastAsia="Symbol" w:cs="Symbol"/>
+          <w:highlight w:val="cyan"/>
+          <w:lang w:eastAsia="zh-CN"/>
+        </w:rPr>
+        <w:t></w:t>
+      </w:r>
+      <w:r>
+        <w:rPr>
+          <w:rFonts w:hint="eastAsia" w:cs="宋体"/>
+          <w:highlight w:val="cyan"/>
+          <w:lang w:eastAsia="zh-CN"/>
+        </w:rPr>
+        <w:t xml:space="preserve">  </w:t>
+      </w:r>
+      <w:r>
+        <w:rPr>
+          <w:color w:val="000000"/>
+          <w:szCs w:val="24"/>
+          <w:highlight w:val="cyan"/>
+          <w:lang w:eastAsia="zh-CN"/>
+        </w:rPr>
+        <w:t>服务项目：</w:t>
+      </w:r>
+      <w:r>
+        <w:rPr>
+          <w:color w:val="000000"/>
+          <w:szCs w:val="24"/>
+          <w:highlight w:val="cyan"/>
+          <w:u w:val="single"/>
+          <w:lang w:eastAsia="zh-CN"/>
+        </w:rPr>
+        <w:t xml:space="preserve">      </w:t>
+      </w:r>
+      <w:r>
+        <w:rPr>
+          <w:rFonts w:hint="eastAsia"/>
+          <w:color w:val="000000"/>
+          <w:szCs w:val="24"/>
+          <w:highlight w:val="cyan"/>
+          <w:u w:val="single"/>
           <w:lang w:val="en-US" w:eastAsia="zh-CN"/>
         </w:rPr>
-        <w:t>一百二十</w:t>
-      </w:r>
-      <w:bookmarkStart w:id="1" w:name="_GoBack"/>
-      <w:bookmarkEnd w:id="1"/>
-      <w:r>
-        <w:rPr>
-          <w:rFonts w:hint="eastAsia"/>
-          <w:highlight w:val="cyan"/>
-          <w:lang w:val="en-US" w:eastAsia="zh-CN"/>
-        </w:rPr>
-        <w:t>二</w:t>
-      </w:r>
-      <w:r>
-        <w:rPr>
-          <w:highlight w:val="cyan"/>
-          <w:lang w:eastAsia="zh-CN"/>
-        </w:rPr>
-        <w:t>___________元整），包含人工费、税费、材料费、差旅费等全部费用；</w:t>
-      </w:r>
-    </w:p>
-    <w:p>
-      <w:pPr>
-        <w:pStyle w:val="11"/>
-        <w:rPr>
-          <w:highlight w:val="cyan"/>
-          <w:lang w:eastAsia="zh-CN"/>
-        </w:rPr>
-      </w:pPr>
-      <w:r>
-        <w:rPr>
-          <w:highlight w:val="cyan"/>
-          <w:lang w:eastAsia="zh-CN"/>
-        </w:rPr>
-        <w:t>（2）按服务量计费：具体收费标准如下表：</w:t>
-      </w:r>
-    </w:p>
-    <w:p>
-      <w:pPr>
-        <w:spacing w:after="0" w:line="360" w:lineRule="atLeast"/>
+        <w:t>咨询</w:t>
+      </w:r>
+      <w:r>
         <w:rPr>
           <w:color w:val="000000"/>
           <w:szCs w:val="24"/>
           <w:highlight w:val="cyan"/>
-          <w:lang w:eastAsia="zh-CN"/>
-        </w:rPr>
-      </w:pPr>
-      <w:r>
-        <w:rPr>
-          <w:rFonts w:ascii="Symbol" w:hAnsi="Symbol" w:eastAsia="Symbol" w:cs="Symbol"/>
-          <w:highlight w:val="cyan"/>
-          <w:lang w:eastAsia="zh-CN"/>
-        </w:rPr>
-        <w:t></w:t>
-      </w:r>
-      <w:r>
-        <w:rPr>
-          <w:rFonts w:hint="eastAsia" w:cs="宋体"/>
-          <w:highlight w:val="cyan"/>
-          <w:lang w:eastAsia="zh-CN"/>
-        </w:rPr>
-        <w:t xml:space="preserve">  </w:t>
-      </w:r>
-      <w:r>
-        <w:rPr>
-          <w:color w:val="000000"/>
-          <w:szCs w:val="24"/>
-          <w:highlight w:val="cyan"/>
-          <w:lang w:eastAsia="zh-CN"/>
-        </w:rPr>
-        <w:t>服务项目：</w:t>
-      </w:r>
-      <w:r>
-        <w:rPr>
-          <w:color w:val="000000"/>
-          <w:szCs w:val="24"/>
-          <w:highlight w:val="cyan"/>
           <w:u w:val="single"/>
           <w:lang w:eastAsia="zh-CN"/>
         </w:rPr>
-        <w:t xml:space="preserve">             </w:t>
+        <w:t xml:space="preserve">     </w:t>
       </w:r>
       <w:r>
         <w:rPr>
@@ -886,12 +1474,43 @@
       </w:r>
       <w:r>
         <w:rPr>
+          <w:rStyle w:val="6"/>
+          <w:rFonts w:hint="eastAsia"/>
+          <w:bCs/>
           <w:color w:val="000000"/>
           <w:szCs w:val="24"/>
           <w:highlight w:val="cyan"/>
-          <w:lang w:eastAsia="zh-CN"/>
-        </w:rPr>
-        <w:t>，单价：__________元；</w:t>
+          <w:lang w:val="en-US" w:eastAsia="zh-CN"/>
+        </w:rPr>
+        <w:t>份</w:t>
+      </w:r>
+      <w:r>
+        <w:rPr>
+          <w:color w:val="000000"/>
+          <w:szCs w:val="24"/>
+          <w:highlight w:val="cyan"/>
+          <w:lang w:eastAsia="zh-CN"/>
+        </w:rPr>
+        <w:t>，单价：____</w:t>
+      </w:r>
+      <w:r>
+        <w:rPr>
+          <w:rFonts w:hint="eastAsia"/>
+          <w:color w:val="000000"/>
+          <w:szCs w:val="24"/>
+          <w:highlight w:val="cyan"/>
+          <w:lang w:val="en-US" w:eastAsia="zh-CN"/>
+        </w:rPr>
+        <w:t>120</w:t>
+      </w:r>
+      <w:r>
+        <w:rPr>
+          <w:color w:val="000000"/>
+          <w:szCs w:val="24"/>
+          <w:highlight w:val="cyan"/>
+          <w:lang w:eastAsia="zh-CN"/>
+        </w:rPr>
+        <w:t>______元；</w:t>
       </w:r>
     </w:p>
     <w:p>
@@ -938,7 +1557,29 @@
           <w:u w:val="single"/>
           <w:lang w:eastAsia="zh-CN"/>
         </w:rPr>
-        <w:t xml:space="preserve">             </w:t>
+        <w:t xml:space="preserve">        </w:t>
+      </w:r>
+      <w:r>
+        <w:rPr>
+          <w:rFonts w:hint="eastAsia"/>
+          <w:color w:val="000000"/>
+          <w:szCs w:val="24"/>
+          <w:highlight w:val="cyan"/>
+          <w:u w:val="single"/>
+          <w:lang w:val="en-US" w:eastAsia="zh-CN"/>
+        </w:rPr>
+        <w:t>维护</w:t>
+      </w:r>
+      <w:r>
+        <w:rPr>
+          <w:rFonts w:hint="eastAsia"/>
+          <w:color w:val="000000"/>
+          <w:szCs w:val="24"/>
+          <w:highlight w:val="cyan"/>
+          <w:u w:val="single"/>
+          <w:lang w:eastAsia="zh-CN"/>
+        </w:rPr>
+        <w:t xml:space="preserve">     </w:t>
       </w:r>
       <w:r>
         <w:rPr>
@@ -953,12 +1594,43 @@
       </w:r>
       <w:r>
         <w:rPr>
+          <w:rStyle w:val="6"/>
+          <w:rFonts w:hint="eastAsia"/>
+          <w:bCs/>
           <w:color w:val="000000"/>
           <w:szCs w:val="24"/>
           <w:highlight w:val="cyan"/>
-          <w:lang w:eastAsia="zh-CN"/>
-        </w:rPr>
-        <w:t>，单价：__________元；</w:t>
+          <w:lang w:val="en-US" w:eastAsia="zh-CN"/>
+        </w:rPr>
+        <w:t>件</w:t>
+      </w:r>
+      <w:r>
+        <w:rPr>
+          <w:color w:val="000000"/>
+          <w:szCs w:val="24"/>
+          <w:highlight w:val="cyan"/>
+          <w:lang w:eastAsia="zh-CN"/>
+        </w:rPr>
+        <w:t>，单价：____</w:t>
+      </w:r>
+      <w:r>
+        <w:rPr>
+          <w:rFonts w:hint="eastAsia"/>
+          <w:color w:val="000000"/>
+          <w:szCs w:val="24"/>
+          <w:highlight w:val="cyan"/>
+          <w:lang w:val="en-US" w:eastAsia="zh-CN"/>
+        </w:rPr>
+        <w:t>120</w:t>
+      </w:r>
+      <w:r>
+        <w:rPr>
+          <w:color w:val="000000"/>
+          <w:szCs w:val="24"/>
+          <w:highlight w:val="cyan"/>
+          <w:lang w:eastAsia="zh-CN"/>
+        </w:rPr>
+        <w:t>______元；</w:t>
       </w:r>
     </w:p>
     <w:p>
@@ -1005,7 +1677,29 @@
           <w:u w:val="single"/>
           <w:lang w:eastAsia="zh-CN"/>
         </w:rPr>
-        <w:t xml:space="preserve">             </w:t>
+        <w:t xml:space="preserve">        </w:t>
+      </w:r>
+      <w:r>
+        <w:rPr>
+          <w:rFonts w:hint="eastAsia"/>
+          <w:color w:val="000000"/>
+          <w:szCs w:val="24"/>
+          <w:highlight w:val="cyan"/>
+          <w:u w:val="single"/>
+          <w:lang w:val="en-US" w:eastAsia="zh-CN"/>
+        </w:rPr>
+        <w:t>变更</w:t>
+      </w:r>
+      <w:r>
+        <w:rPr>
+          <w:rFonts w:hint="eastAsia"/>
+          <w:color w:val="000000"/>
+          <w:szCs w:val="24"/>
+          <w:highlight w:val="cyan"/>
+          <w:u w:val="single"/>
+          <w:lang w:eastAsia="zh-CN"/>
+        </w:rPr>
+        <w:t xml:space="preserve">     </w:t>
       </w:r>
       <w:r>
         <w:rPr>
@@ -1020,37 +1714,83 @@
       </w:r>
       <w:r>
         <w:rPr>
+          <w:rStyle w:val="6"/>
+          <w:rFonts w:hint="eastAsia"/>
+          <w:bCs/>
           <w:color w:val="000000"/>
           <w:szCs w:val="24"/>
           <w:highlight w:val="cyan"/>
-          <w:lang w:eastAsia="zh-CN"/>
-        </w:rPr>
-        <w:t>，单价：__________元。</w:t>
-      </w:r>
-    </w:p>
-    <w:p>
-      <w:pPr>
-        <w:pStyle w:val="11"/>
-        <w:rPr>
-          <w:highlight w:val="cyan"/>
-          <w:lang w:eastAsia="zh-CN"/>
-        </w:rPr>
-      </w:pPr>
-    </w:p>
-    <w:p>
-      <w:pPr>
-        <w:pStyle w:val="11"/>
-        <w:rPr>
-          <w:highlight w:val="cyan"/>
-          <w:lang w:eastAsia="zh-CN"/>
-        </w:rPr>
-      </w:pPr>
-      <w:r>
-        <w:rPr>
-          <w:highlight w:val="cyan"/>
-          <w:lang w:eastAsia="zh-CN"/>
-        </w:rPr>
-        <w:t>（3）按实际成本加合理利润计费：成本据实核算，利润率为______%。</w:t>
+          <w:lang w:val="en-US" w:eastAsia="zh-CN"/>
+        </w:rPr>
+        <w:t>元</w:t>
+      </w:r>
+      <w:r>
+        <w:rPr>
+          <w:color w:val="000000"/>
+          <w:szCs w:val="24"/>
+          <w:highlight w:val="cyan"/>
+          <w:lang w:eastAsia="zh-CN"/>
+        </w:rPr>
+        <w:t>，单价：_____</w:t>
+      </w:r>
+      <w:r>
+        <w:rPr>
+          <w:rFonts w:hint="eastAsia"/>
+          <w:color w:val="000000"/>
+          <w:szCs w:val="24"/>
+          <w:highlight w:val="cyan"/>
+          <w:lang w:val="en-US" w:eastAsia="zh-CN"/>
+        </w:rPr>
+        <w:t>120</w:t>
+      </w:r>
+      <w:r>
+        <w:rPr>
+          <w:color w:val="000000"/>
+          <w:szCs w:val="24"/>
+          <w:highlight w:val="cyan"/>
+          <w:lang w:eastAsia="zh-CN"/>
+        </w:rPr>
+        <w:t>_____元。</w:t>
+      </w:r>
+    </w:p>
+    <w:p>
+      <w:pPr>
+        <w:pStyle w:val="11"/>
+        <w:rPr>
+          <w:highlight w:val="cyan"/>
+          <w:lang w:eastAsia="zh-CN"/>
+        </w:rPr>
+      </w:pPr>
+    </w:p>
+    <w:p>
+      <w:pPr>
+        <w:pStyle w:val="11"/>
+        <w:rPr>
+          <w:highlight w:val="cyan"/>
+          <w:lang w:eastAsia="zh-CN"/>
+        </w:rPr>
+      </w:pPr>
+      <w:r>
+        <w:rPr>
+          <w:highlight w:val="cyan"/>
+          <w:lang w:eastAsia="zh-CN"/>
+        </w:rPr>
+        <w:t>（3）按实际成本加合理利润计费：成本据实核算，利润率为___</w:t>
+      </w:r>
+      <w:r>
+        <w:rPr>
+          <w:rFonts w:hint="eastAsia"/>
+          <w:highlight w:val="cyan"/>
+          <w:lang w:val="en-US" w:eastAsia="zh-CN"/>
+        </w:rPr>
+        <w:t>12</w:t>
+      </w:r>
+      <w:r>
+        <w:rPr>
+          <w:highlight w:val="cyan"/>
+          <w:lang w:eastAsia="zh-CN"/>
+        </w:rPr>
+        <w:t>___%。</w:t>
       </w:r>
     </w:p>
     <w:p>
@@ -1080,39 +1820,174 @@
           <w:highlight w:val="cyan"/>
           <w:lang w:eastAsia="zh-CN"/>
         </w:rPr>
-        <w:t>（1）预付款：协议生效后____个工作日内，甲方向乙方支付总费用的______%作为预付款，即人民币______元；</w:t>
-      </w:r>
-    </w:p>
-    <w:p>
-      <w:pPr>
-        <w:pStyle w:val="11"/>
-        <w:rPr>
-          <w:highlight w:val="cyan"/>
-          <w:lang w:eastAsia="zh-CN"/>
-        </w:rPr>
-      </w:pPr>
-      <w:r>
-        <w:rPr>
-          <w:highlight w:val="cyan"/>
-          <w:lang w:eastAsia="zh-CN"/>
-        </w:rPr>
-        <w:t>（2）进度款：________________________阶段完成并经甲方确认后____个工作日内，支付总费用的______%，即人民币______元；</w:t>
-      </w:r>
-    </w:p>
-    <w:p>
-      <w:pPr>
-        <w:pStyle w:val="11"/>
-        <w:rPr>
-          <w:highlight w:val="cyan"/>
-          <w:lang w:eastAsia="zh-CN"/>
-        </w:rPr>
-      </w:pPr>
-      <w:r>
-        <w:rPr>
-          <w:highlight w:val="cyan"/>
-          <w:lang w:eastAsia="zh-CN"/>
-        </w:rPr>
-        <w:t>（3）尾款：咨询成果经甲方最终验收合格后____个工作日内，支付剩余费用，即人民币______元。</w:t>
+        <w:t>（1）预付款：协议生效后__</w:t>
+      </w:r>
+      <w:r>
+        <w:rPr>
+          <w:rFonts w:hint="eastAsia"/>
+          <w:highlight w:val="cyan"/>
+          <w:lang w:val="en-US" w:eastAsia="zh-CN"/>
+        </w:rPr>
+        <w:t>5</w:t>
+      </w:r>
+      <w:r>
+        <w:rPr>
+          <w:highlight w:val="cyan"/>
+          <w:lang w:eastAsia="zh-CN"/>
+        </w:rPr>
+        <w:t>__个工作日内，甲方向乙方支付总费用的__</w:t>
+      </w:r>
+      <w:r>
+        <w:rPr>
+          <w:rFonts w:hint="eastAsia"/>
+          <w:highlight w:val="cyan"/>
+          <w:lang w:val="en-US" w:eastAsia="zh-CN"/>
+        </w:rPr>
+        <w:t>30</w:t>
+      </w:r>
+      <w:r>
+        <w:rPr>
+          <w:highlight w:val="cyan"/>
+          <w:lang w:eastAsia="zh-CN"/>
+        </w:rPr>
+        <w:t>____%作为预付款，即人民币____</w:t>
+      </w:r>
+      <w:r>
+        <w:rPr>
+          <w:rFonts w:hint="eastAsia"/>
+          <w:highlight w:val="cyan"/>
+          <w:lang w:val="en-US" w:eastAsia="zh-CN"/>
+        </w:rPr>
+        <w:t>84000</w:t>
+      </w:r>
+      <w:r>
+        <w:rPr>
+          <w:highlight w:val="cyan"/>
+          <w:lang w:eastAsia="zh-CN"/>
+        </w:rPr>
+        <w:t>__元；</w:t>
+      </w:r>
+    </w:p>
+    <w:p>
+      <w:pPr>
+        <w:pStyle w:val="11"/>
+        <w:rPr>
+          <w:highlight w:val="cyan"/>
+          <w:lang w:eastAsia="zh-CN"/>
+        </w:rPr>
+      </w:pPr>
+      <w:r>
+        <w:rPr>
+          <w:highlight w:val="cyan"/>
+          <w:lang w:eastAsia="zh-CN"/>
+        </w:rPr>
+        <w:t>（2）进度款：__________</w:t>
+      </w:r>
+      <w:r>
+        <w:rPr>
+          <w:rFonts w:ascii="宋体" w:hAnsi="宋体" w:eastAsia="宋体" w:cs="宋体"/>
+          <w:sz w:val="24"/>
+          <w:szCs w:val="24"/>
+        </w:rPr>
+        <w:t>现状诊断与战略框架</w:t>
+      </w:r>
+      <w:r>
+        <w:rPr>
+          <w:highlight w:val="cyan"/>
+          <w:lang w:eastAsia="zh-CN"/>
+        </w:rPr>
+        <w:t>______________阶段完成并经甲方确认后__</w:t>
+      </w:r>
+      <w:r>
+        <w:rPr>
+          <w:rFonts w:hint="eastAsia"/>
+          <w:highlight w:val="cyan"/>
+          <w:lang w:val="en-US" w:eastAsia="zh-CN"/>
+        </w:rPr>
+        <w:t>5</w:t>
+      </w:r>
+      <w:r>
+        <w:rPr>
+          <w:highlight w:val="cyan"/>
+          <w:lang w:eastAsia="zh-CN"/>
+        </w:rPr>
+        <w:t>__个工作日内，支付总费用的___</w:t>
+      </w:r>
+      <w:r>
+        <w:rPr>
+          <w:rFonts w:hint="eastAsia"/>
+          <w:highlight w:val="cyan"/>
+          <w:lang w:val="en-US" w:eastAsia="zh-CN"/>
+        </w:rPr>
+        <w:t>40</w:t>
+      </w:r>
+      <w:r>
+        <w:rPr>
+          <w:highlight w:val="cyan"/>
+          <w:lang w:eastAsia="zh-CN"/>
+        </w:rPr>
+        <w:t>___%，即人民币___</w:t>
+      </w:r>
+      <w:r>
+        <w:rPr>
+          <w:rFonts w:hint="eastAsia"/>
+          <w:highlight w:val="cyan"/>
+          <w:lang w:val="en-US" w:eastAsia="zh-CN"/>
+        </w:rPr>
+        <w:t>112000</w:t>
+      </w:r>
+      <w:r>
+        <w:rPr>
+          <w:highlight w:val="cyan"/>
+          <w:lang w:eastAsia="zh-CN"/>
+        </w:rPr>
+        <w:t>___元；</w:t>
+      </w:r>
+    </w:p>
+    <w:p>
+      <w:pPr>
+        <w:pStyle w:val="11"/>
+        <w:rPr>
+          <w:highlight w:val="cyan"/>
+          <w:lang w:eastAsia="zh-CN"/>
+        </w:rPr>
+      </w:pPr>
+      <w:r>
+        <w:rPr>
+          <w:highlight w:val="cyan"/>
+          <w:lang w:eastAsia="zh-CN"/>
+        </w:rPr>
+        <w:t>（3）尾款：咨询成果经甲方最终验收合格后__</w:t>
+      </w:r>
+      <w:r>
+        <w:rPr>
+          <w:rFonts w:hint="eastAsia"/>
+          <w:highlight w:val="cyan"/>
+          <w:lang w:val="en-US" w:eastAsia="zh-CN"/>
+        </w:rPr>
+        <w:t>5</w:t>
+      </w:r>
+      <w:r>
+        <w:rPr>
+          <w:highlight w:val="cyan"/>
+          <w:lang w:eastAsia="zh-CN"/>
+        </w:rPr>
+        <w:t>__个工作日内，支付剩余费用，即人民币___</w:t>
+      </w:r>
+      <w:r>
+        <w:rPr>
+          <w:rFonts w:hint="eastAsia"/>
+          <w:highlight w:val="cyan"/>
+          <w:lang w:val="en-US" w:eastAsia="zh-CN"/>
+        </w:rPr>
+        <w:t>84000</w:t>
+      </w:r>
+      <w:r>
+        <w:rPr>
+          <w:highlight w:val="cyan"/>
+          <w:lang w:eastAsia="zh-CN"/>
+        </w:rPr>
+        <w:t>___元。</w:t>
       </w:r>
     </w:p>
     <w:p>
@@ -1160,7 +2035,22 @@
           <w:highlight w:val="yellow"/>
           <w:lang w:eastAsia="zh-CN"/>
         </w:rPr>
-        <w:t>户名：________________________________</w:t>
+        <w:t>户名：____________</w:t>
+      </w:r>
+      <w:r>
+        <w:rPr>
+          <w:rFonts w:ascii="宋体" w:hAnsi="宋体" w:eastAsia="宋体" w:cs="宋体"/>
+          <w:sz w:val="24"/>
+          <w:szCs w:val="24"/>
+        </w:rPr>
+        <w:t>上海智远企业咨询有限公司</w:t>
+      </w:r>
+      <w:r>
+        <w:rPr>
+          <w:highlight w:val="yellow"/>
+          <w:lang w:eastAsia="zh-CN"/>
+        </w:rPr>
+        <w:t>____________________</w:t>
       </w:r>
     </w:p>
     <w:p>
@@ -1176,7 +2066,22 @@
           <w:highlight w:val="yellow"/>
           <w:lang w:eastAsia="zh-CN"/>
         </w:rPr>
-        <w:t>账号：________________________________</w:t>
+        <w:t>账号：____________</w:t>
+      </w:r>
+      <w:r>
+        <w:rPr>
+          <w:rFonts w:ascii="宋体" w:hAnsi="宋体" w:eastAsia="宋体" w:cs="宋体"/>
+          <w:sz w:val="24"/>
+          <w:szCs w:val="24"/>
+        </w:rPr>
+        <w:t>1234567890123456789</w:t>
+      </w:r>
+      <w:r>
+        <w:rPr>
+          <w:highlight w:val="yellow"/>
+          <w:lang w:eastAsia="zh-CN"/>
+        </w:rPr>
+        <w:t>____________________</w:t>
       </w:r>
     </w:p>
     <w:p>
@@ -1192,7 +2097,22 @@
           <w:highlight w:val="yellow"/>
           <w:lang w:eastAsia="zh-CN"/>
         </w:rPr>
-        <w:t>开户行：______________________________</w:t>
+        <w:t>开户行：________</w:t>
+      </w:r>
+      <w:r>
+        <w:rPr>
+          <w:rFonts w:ascii="宋体" w:hAnsi="宋体" w:eastAsia="宋体" w:cs="宋体"/>
+          <w:sz w:val="24"/>
+          <w:szCs w:val="24"/>
+        </w:rPr>
+        <w:t>中国工商银行上海市徐汇支行</w:t>
+      </w:r>
+      <w:r>
+        <w:rPr>
+          <w:highlight w:val="yellow"/>
+          <w:lang w:eastAsia="zh-CN"/>
+        </w:rPr>
+        <w:t>______________________</w:t>
       </w:r>
     </w:p>
     <w:permEnd w:id="6"/>
@@ -1207,7 +2127,20 @@
         <w:rPr>
           <w:lang w:eastAsia="zh-CN"/>
         </w:rPr>
-        <w:t>4.5 甲方逾期支付费用的，每逾期一日，应按应付未付金额的万分之三向乙方支付违约金；逾期超过45日的，乙方有权暂停服务；逾期超过90日的，乙方有权单方解除本协议。</w:t>
+        <w:t>4.5 甲方逾期支付费用的，每逾期一日，应按应付未付金额的万分之三向乙方支付违约金；逾期超过</w:t>
+      </w:r>
+      <w:r>
+        <w:rPr>
+          <w:rFonts w:hint="eastAsia"/>
+          <w:lang w:val="en-US" w:eastAsia="zh-CN"/>
+        </w:rPr>
+        <w:t>45</w:t>
+      </w:r>
+      <w:r>
+        <w:rPr>
+          <w:lang w:eastAsia="zh-CN"/>
+        </w:rPr>
+        <w:t>日的，乙方有权暂停服务；逾期超过90日的，乙方有权单方解除本协议。</w:t>
       </w:r>
     </w:p>
     <w:p>
@@ -1235,7 +2168,20 @@
         <w:rPr>
           <w:lang w:eastAsia="zh-CN"/>
         </w:rPr>
-        <w:t>5.1 乙方提交咨询成果后，甲方应在5个工作日内组织验收，出具验收意见。</w:t>
+        <w:t>5.1 乙方提交咨询成果后，甲方应在</w:t>
+      </w:r>
+      <w:r>
+        <w:rPr>
+          <w:rFonts w:hint="eastAsia"/>
+          <w:lang w:val="en-US" w:eastAsia="zh-CN"/>
+        </w:rPr>
+        <w:t>3</w:t>
+      </w:r>
+      <w:r>
+        <w:rPr>
+          <w:lang w:eastAsia="zh-CN"/>
+        </w:rPr>
+        <w:t>个工作日内组织验收，出具验收意见。</w:t>
       </w:r>
     </w:p>
     <w:p>
@@ -1291,20 +2237,6 @@
         <w:rPr>
           <w:lang w:eastAsia="zh-CN"/>
         </w:rPr>
-        <w:t>（2）内容真实、准确、完整，具有实际应用价值；</w:t>
-      </w:r>
-    </w:p>
-    <w:p>
-      <w:pPr>
-        <w:pStyle w:val="11"/>
-        <w:rPr>
-          <w:lang w:eastAsia="zh-CN"/>
-        </w:rPr>
-      </w:pPr>
-      <w:r>
-        <w:rPr>
-          <w:lang w:eastAsia="zh-CN"/>
-        </w:rPr>
         <w:t>（3）符合相关行业规范和技术标准。</w:t>
       </w:r>
     </w:p>
@@ -1319,7 +2251,20 @@
         <w:rPr>
           <w:lang w:eastAsia="zh-CN"/>
         </w:rPr>
-        <w:t>5.3 对验收不合格的咨询成果，甲方应书面说明不合格原因，乙方应在5个工作日内修改完善并重新提交验收，直至验收合格。因乙方原因导致多次验收不合格的，甲方有权解除协议并追究乙方违约责任。</w:t>
+        <w:t>5.3 对验收不合格的咨询成果，甲方应书面说明不合格原因，乙方应在</w:t>
+      </w:r>
+      <w:r>
+        <w:rPr>
+          <w:rFonts w:hint="eastAsia"/>
+          <w:lang w:val="en-US" w:eastAsia="zh-CN"/>
+        </w:rPr>
+        <w:t>5</w:t>
+      </w:r>
+      <w:r>
+        <w:rPr>
+          <w:lang w:eastAsia="zh-CN"/>
+        </w:rPr>
+        <w:t>个工作日内修改完善并重新提交验收，直至验收合格。因乙方原因导致多次验收不合格的，甲方有权解除协议并追究乙方违约责任。</w:t>
       </w:r>
     </w:p>
     <w:p>
@@ -1506,6 +2451,50 @@
     </w:p>
     <w:p>
       <w:pPr>
+        <w:pStyle w:val="11"/>
+        <w:rPr>
+          <w:rFonts w:hint="default"/>
+          <w:lang w:val="en-US" w:eastAsia="zh-CN"/>
+        </w:rPr>
+      </w:pPr>
+      <w:r>
+        <w:rPr>
+          <w:lang w:eastAsia="zh-CN"/>
+        </w:rPr>
+        <w:t>（</w:t>
+      </w:r>
+      <w:r>
+        <w:rPr>
+          <w:rFonts w:hint="eastAsia"/>
+          <w:lang w:val="en-US" w:eastAsia="zh-CN"/>
+        </w:rPr>
+        <w:t>5</w:t>
+      </w:r>
+      <w:r>
+        <w:rPr>
+          <w:lang w:eastAsia="zh-CN"/>
+        </w:rPr>
+        <w:t>）</w:t>
+      </w:r>
+      <w:r>
+        <w:rPr>
+          <w:rFonts w:hint="eastAsia"/>
+          <w:lang w:val="en-US" w:eastAsia="zh-CN"/>
+        </w:rPr>
+        <w:t>乙方不对数据泄露事件负任何责任</w:t>
+      </w:r>
+    </w:p>
+    <w:p>
+      <w:pPr>
+        <w:pStyle w:val="11"/>
+        <w:ind w:left="0" w:leftChars="0" w:firstLine="0" w:firstLineChars="0"/>
+        <w:rPr>
+          <w:lang w:eastAsia="zh-CN"/>
+        </w:rPr>
+      </w:pPr>
+    </w:p>
+    <w:p>
+      <w:pPr>
         <w:pStyle w:val="8"/>
         <w:rPr>
           <w:lang w:eastAsia="zh-CN"/>
@@ -1670,20 +2659,6 @@
           <w:lang w:eastAsia="zh-CN"/>
         </w:rPr>
         <w:t>（1）未按约定期限完成服务或提交咨询成果的，每逾期一日，应按总服务费用的万分之五向甲方支付违约金；逾期超过30日的，甲方有权解除协议；</w:t>
-      </w:r>
-    </w:p>
-    <w:p>
-      <w:pPr>
-        <w:pStyle w:val="11"/>
-        <w:rPr>
-          <w:lang w:eastAsia="zh-CN"/>
-        </w:rPr>
-      </w:pPr>
-      <w:r>
-        <w:rPr>
-          <w:lang w:eastAsia="zh-CN"/>
-        </w:rPr>
-        <w:t>（3）无故单方解除协议的，应向乙方支付总服务费用的20%作为违约金，并赔偿乙方因此遭受的实际损失。</w:t>
       </w:r>
     </w:p>
     <w:p>
@@ -2218,6 +3193,8 @@
               </w:rPr>
               <w:t>乙方（盖章）：</w:t>
             </w:r>
+            <w:bookmarkStart w:id="1" w:name="_GoBack"/>
+            <w:bookmarkEnd w:id="1"/>
           </w:p>
         </w:tc>
       </w:tr>
@@ -2260,6 +3237,14 @@
               </w:rPr>
               <w:t>法定代表人/负责人：</w:t>
             </w:r>
+            <w:r>
+              <w:rPr>
+                <w:rFonts w:ascii="宋体" w:hAnsi="宋体" w:eastAsia="宋体" w:cs="宋体"/>
+                <w:sz w:val="24"/>
+                <w:szCs w:val="24"/>
+              </w:rPr>
+              <w:t>张明</w:t>
+            </w:r>
           </w:p>
         </w:tc>
         <w:tc>
@@ -2279,6 +3264,14 @@
                 <w:highlight w:val="yellow"/>
               </w:rPr>
               <w:t>法定代表人：</w:t>
+            </w:r>
+            <w:r>
+              <w:rPr>
+                <w:rFonts w:ascii="宋体" w:hAnsi="宋体" w:eastAsia="宋体" w:cs="宋体"/>
+                <w:sz w:val="24"/>
+                <w:szCs w:val="24"/>
+              </w:rPr>
+              <w:t>王建国</w:t>
             </w:r>
           </w:p>
         </w:tc>
@@ -2322,6 +3315,14 @@
               </w:rPr>
               <w:t>授权代理人：</w:t>
             </w:r>
+            <w:r>
+              <w:rPr>
+                <w:rFonts w:ascii="宋体" w:hAnsi="宋体" w:eastAsia="宋体" w:cs="宋体"/>
+                <w:sz w:val="24"/>
+                <w:szCs w:val="24"/>
+              </w:rPr>
+              <w:t>李文博</w:t>
+            </w:r>
           </w:p>
         </w:tc>
         <w:tc>
@@ -2341,6 +3342,14 @@
                 <w:highlight w:val="yellow"/>
               </w:rPr>
               <w:t>授权代理人：</w:t>
+            </w:r>
+            <w:r>
+              <w:rPr>
+                <w:rFonts w:ascii="宋体" w:hAnsi="宋体" w:eastAsia="宋体" w:cs="宋体"/>
+                <w:sz w:val="24"/>
+                <w:szCs w:val="24"/>
+              </w:rPr>
+              <w:t>赵晓琳</w:t>
             </w:r>
           </w:p>
         </w:tc>
@@ -2382,7 +3391,49 @@
               <w:rPr>
                 <w:highlight w:val="yellow"/>
               </w:rPr>
-              <w:t>日期：______年____月____日</w:t>
+              <w:t>日期：___</w:t>
+            </w:r>
+            <w:r>
+              <w:rPr>
+                <w:rFonts w:hint="eastAsia"/>
+                <w:highlight w:val="yellow"/>
+                <w:lang w:val="en-US" w:eastAsia="zh-CN"/>
+              </w:rPr>
+              <w:t>2024</w:t>
+            </w:r>
+            <w:r>
+              <w:rPr>
+                <w:highlight w:val="yellow"/>
+              </w:rPr>
+              <w:t>___年__</w:t>
+            </w:r>
+            <w:r>
+              <w:rPr>
+                <w:rFonts w:hint="eastAsia"/>
+                <w:highlight w:val="yellow"/>
+                <w:lang w:val="en-US" w:eastAsia="zh-CN"/>
+              </w:rPr>
+              <w:t>6</w:t>
+            </w:r>
+            <w:r>
+              <w:rPr>
+                <w:highlight w:val="yellow"/>
+              </w:rPr>
+              <w:t>__月__</w:t>
+            </w:r>
+            <w:r>
+              <w:rPr>
+                <w:rFonts w:hint="eastAsia"/>
+                <w:highlight w:val="yellow"/>
+                <w:lang w:val="en-US" w:eastAsia="zh-CN"/>
+              </w:rPr>
+              <w:t>25</w:t>
+            </w:r>
+            <w:r>
+              <w:rPr>
+                <w:highlight w:val="yellow"/>
+              </w:rPr>
+              <w:t>__日</w:t>
             </w:r>
           </w:p>
         </w:tc>
@@ -2402,7 +3453,49 @@
               <w:rPr>
                 <w:highlight w:val="yellow"/>
               </w:rPr>
-              <w:t>日期：______年____月____日</w:t>
+              <w:t>日期：___</w:t>
+            </w:r>
+            <w:r>
+              <w:rPr>
+                <w:rFonts w:hint="eastAsia"/>
+                <w:highlight w:val="yellow"/>
+                <w:lang w:val="en-US" w:eastAsia="zh-CN"/>
+              </w:rPr>
+              <w:t>2024</w:t>
+            </w:r>
+            <w:r>
+              <w:rPr>
+                <w:highlight w:val="yellow"/>
+              </w:rPr>
+              <w:t>___年__</w:t>
+            </w:r>
+            <w:r>
+              <w:rPr>
+                <w:rFonts w:hint="eastAsia"/>
+                <w:highlight w:val="yellow"/>
+                <w:lang w:val="en-US" w:eastAsia="zh-CN"/>
+              </w:rPr>
+              <w:t>6</w:t>
+            </w:r>
+            <w:r>
+              <w:rPr>
+                <w:highlight w:val="yellow"/>
+              </w:rPr>
+              <w:t>__月__</w:t>
+            </w:r>
+            <w:r>
+              <w:rPr>
+                <w:rFonts w:hint="eastAsia"/>
+                <w:highlight w:val="yellow"/>
+                <w:lang w:val="en-US" w:eastAsia="zh-CN"/>
+              </w:rPr>
+              <w:t>25</w:t>
+            </w:r>
+            <w:r>
+              <w:rPr>
+                <w:highlight w:val="yellow"/>
+              </w:rPr>
+              <w:t>__日</w:t>
             </w:r>
           </w:p>
         </w:tc>
@@ -2559,7 +3652,7 @@
     <w:lsdException w:qFormat="1" w:unhideWhenUsed="0" w:uiPriority="10" w:semiHidden="0" w:name="Title"/>
     <w:lsdException w:uiPriority="99" w:name="Closing"/>
     <w:lsdException w:uiPriority="99" w:name="Signature"/>
-    <w:lsdException w:qFormat="1" w:uiPriority="1" w:name="Default Paragraph Font"/>
+    <w:lsdException w:uiPriority="1" w:name="Default Paragraph Font"/>
     <w:lsdException w:uiPriority="99" w:name="Body Text"/>
     <w:lsdException w:uiPriority="99" w:name="Body Text Indent"/>
     <w:lsdException w:uiPriority="99" w:name="List Continue"/>
@@ -2762,7 +3855,6 @@
     <w:name w:val="Default Paragraph Font"/>
     <w:semiHidden/>
     <w:unhideWhenUsed/>
-    <w:qFormat/>
     <w:uiPriority w:val="1"/>
   </w:style>
   <w:style w:type="table" w:default="1" w:styleId="3">

</xml_diff>